<commit_message>
knowleddge 7/3/2026 part 4
</commit_message>
<xml_diff>
--- a/Knowledge/3-Work knowledge/1-Software Engineering/2-General Technologies/9-Databases/5-My Source/2-SQL/1-Intro to SQL/1-SQL.docx
+++ b/Knowledge/3-Work knowledge/1-Software Engineering/2-General Technologies/9-Databases/5-My Source/2-SQL/1-Intro to SQL/1-SQL.docx
@@ -27,8 +27,14 @@
       </w:r>
     </w:p>
     <w:p>
-      <w:r>
-        <w:rPr>
+      <w:pPr>
+        <w:rPr>
+          <w:rFonts w:ascii="Arial" w:hAnsi="Arial" w:cs="Arial"/>
+        </w:rPr>
+      </w:pPr>
+      <w:r>
+        <w:rPr>
+          <w:rFonts w:ascii="Arial" w:hAnsi="Arial" w:cs="Arial"/>
           <w:b/>
           <w:color w:val="000000"/>
           <w:sz w:val="18"/>
@@ -38,14 +44,36 @@
       </w:r>
       <w:r>
         <w:rPr>
-          <w:color w:val="000000"/>
-          <w:sz w:val="18"/>
-          <w:highlight w:val="lightGray"/>
-        </w:rPr>
-        <w:t xml:space="preserve">: Persons Table -&gt; ID Column: 1, Name_En Column: Motasem Essam] -&gt; </w:t>
-      </w:r>
-      <w:r>
-        <w:rPr>
+          <w:rFonts w:ascii="Arial" w:hAnsi="Arial" w:cs="Arial"/>
+          <w:color w:val="000000"/>
+          <w:sz w:val="18"/>
+          <w:highlight w:val="lightGray"/>
+        </w:rPr>
+        <w:t xml:space="preserve">: Persons Table -&gt; ID Column: 1, </w:t>
+      </w:r>
+      <w:proofErr w:type="spellStart"/>
+      <w:r>
+        <w:rPr>
+          <w:rFonts w:ascii="Arial" w:hAnsi="Arial" w:cs="Arial"/>
+          <w:color w:val="000000"/>
+          <w:sz w:val="18"/>
+          <w:highlight w:val="lightGray"/>
+        </w:rPr>
+        <w:t>Name_En</w:t>
+      </w:r>
+      <w:proofErr w:type="spellEnd"/>
+      <w:r>
+        <w:rPr>
+          <w:rFonts w:ascii="Arial" w:hAnsi="Arial" w:cs="Arial"/>
+          <w:color w:val="000000"/>
+          <w:sz w:val="18"/>
+          <w:highlight w:val="lightGray"/>
+        </w:rPr>
+        <w:t xml:space="preserve"> Column: Motasem Essam] -&gt; </w:t>
+      </w:r>
+      <w:r>
+        <w:rPr>
+          <w:rFonts w:ascii="Arial" w:hAnsi="Arial" w:cs="Arial"/>
           <w:b/>
           <w:color w:val="000000"/>
           <w:sz w:val="18"/>
@@ -55,6 +83,7 @@
       </w:r>
       <w:r>
         <w:rPr>
+          <w:rFonts w:ascii="Arial" w:hAnsi="Arial" w:cs="Arial"/>
           <w:color w:val="000000"/>
           <w:sz w:val="18"/>
           <w:highlight w:val="lightGray"/>
@@ -63,6 +92,7 @@
       </w:r>
       <w:r>
         <w:rPr>
+          <w:rFonts w:ascii="Arial" w:hAnsi="Arial" w:cs="Arial"/>
           <w:b/>
           <w:color w:val="000000"/>
           <w:sz w:val="18"/>
@@ -72,6 +102,7 @@
       </w:r>
       <w:r>
         <w:rPr>
+          <w:rFonts w:ascii="Arial" w:hAnsi="Arial" w:cs="Arial"/>
           <w:color w:val="000000"/>
           <w:sz w:val="18"/>
           <w:highlight w:val="lightGray"/>
@@ -379,6 +410,7 @@
       </w:pPr>
       <w:r>
         <w:rPr>
+          <w:rFonts w:ascii="Arial" w:hAnsi="Arial" w:cs="Arial"/>
           <w:b/>
           <w:color w:val="000000"/>
           <w:sz w:val="18"/>
@@ -388,14 +420,36 @@
       </w:r>
       <w:r>
         <w:rPr>
-          <w:color w:val="000000"/>
-          <w:sz w:val="18"/>
-          <w:highlight w:val="lightGray"/>
-        </w:rPr>
-        <w:t xml:space="preserve">: Persons Table -&gt; ID Column: 1, Name_En Column: Motasem Essam] -&gt; </w:t>
-      </w:r>
-      <w:r>
-        <w:rPr>
+          <w:rFonts w:ascii="Arial" w:hAnsi="Arial" w:cs="Arial"/>
+          <w:color w:val="000000"/>
+          <w:sz w:val="18"/>
+          <w:highlight w:val="lightGray"/>
+        </w:rPr>
+        <w:t xml:space="preserve">: Persons Table -&gt; ID Column: 1, </w:t>
+      </w:r>
+      <w:proofErr w:type="spellStart"/>
+      <w:r>
+        <w:rPr>
+          <w:rFonts w:ascii="Arial" w:hAnsi="Arial" w:cs="Arial"/>
+          <w:color w:val="000000"/>
+          <w:sz w:val="18"/>
+          <w:highlight w:val="lightGray"/>
+        </w:rPr>
+        <w:t>Name_En</w:t>
+      </w:r>
+      <w:proofErr w:type="spellEnd"/>
+      <w:r>
+        <w:rPr>
+          <w:rFonts w:ascii="Arial" w:hAnsi="Arial" w:cs="Arial"/>
+          <w:color w:val="000000"/>
+          <w:sz w:val="18"/>
+          <w:highlight w:val="lightGray"/>
+        </w:rPr>
+        <w:t xml:space="preserve"> Column: Motasem Essam] -&gt; </w:t>
+      </w:r>
+      <w:r>
+        <w:rPr>
+          <w:rFonts w:ascii="Arial" w:hAnsi="Arial" w:cs="Arial"/>
           <w:b/>
           <w:color w:val="000000"/>
           <w:sz w:val="18"/>
@@ -405,6 +459,7 @@
       </w:r>
       <w:r>
         <w:rPr>
+          <w:rFonts w:ascii="Arial" w:hAnsi="Arial" w:cs="Arial"/>
           <w:color w:val="000000"/>
           <w:sz w:val="18"/>
           <w:highlight w:val="lightGray"/>
@@ -413,6 +468,7 @@
       </w:r>
       <w:r>
         <w:rPr>
+          <w:rFonts w:ascii="Arial" w:hAnsi="Arial" w:cs="Arial"/>
           <w:b/>
           <w:color w:val="000000"/>
           <w:sz w:val="18"/>
@@ -422,6 +478,7 @@
       </w:r>
       <w:r>
         <w:rPr>
+          <w:rFonts w:ascii="Arial" w:hAnsi="Arial" w:cs="Arial"/>
           <w:color w:val="000000"/>
           <w:sz w:val="18"/>
           <w:highlight w:val="lightGray"/>
@@ -523,6 +580,7 @@
         <w:rPr>
           <w:rFonts w:ascii="Roboto Mono" w:eastAsia="Roboto Mono" w:hAnsi="Roboto Mono"/>
         </w:rPr>
+        <w:lastRenderedPageBreak/>
         <w:t xml:space="preserve">Insert data </w:t>
       </w:r>
     </w:p>
@@ -666,6 +724,7 @@
     <w:p>
       <w:r>
         <w:rPr>
+          <w:rFonts w:ascii="Arial" w:hAnsi="Arial" w:cs="Arial"/>
           <w:b/>
           <w:color w:val="000000"/>
           <w:sz w:val="18"/>
@@ -675,14 +734,36 @@
       </w:r>
       <w:r>
         <w:rPr>
-          <w:color w:val="000000"/>
-          <w:sz w:val="18"/>
-          <w:highlight w:val="lightGray"/>
-        </w:rPr>
-        <w:t xml:space="preserve">: Persons Table -&gt; ID Column: 1, Name_En Column: Motasem Essam] -&gt; </w:t>
-      </w:r>
-      <w:r>
-        <w:rPr>
+          <w:rFonts w:ascii="Arial" w:hAnsi="Arial" w:cs="Arial"/>
+          <w:color w:val="000000"/>
+          <w:sz w:val="18"/>
+          <w:highlight w:val="lightGray"/>
+        </w:rPr>
+        <w:t xml:space="preserve">: Persons Table -&gt; ID Column: 1, </w:t>
+      </w:r>
+      <w:proofErr w:type="spellStart"/>
+      <w:r>
+        <w:rPr>
+          <w:rFonts w:ascii="Arial" w:hAnsi="Arial" w:cs="Arial"/>
+          <w:color w:val="000000"/>
+          <w:sz w:val="18"/>
+          <w:highlight w:val="lightGray"/>
+        </w:rPr>
+        <w:t>Name_En</w:t>
+      </w:r>
+      <w:proofErr w:type="spellEnd"/>
+      <w:r>
+        <w:rPr>
+          <w:rFonts w:ascii="Arial" w:hAnsi="Arial" w:cs="Arial"/>
+          <w:color w:val="000000"/>
+          <w:sz w:val="18"/>
+          <w:highlight w:val="lightGray"/>
+        </w:rPr>
+        <w:t xml:space="preserve"> Column: Motasem Essam] -&gt; </w:t>
+      </w:r>
+      <w:r>
+        <w:rPr>
+          <w:rFonts w:ascii="Arial" w:hAnsi="Arial" w:cs="Arial"/>
           <w:b/>
           <w:color w:val="000000"/>
           <w:sz w:val="18"/>
@@ -692,6 +773,7 @@
       </w:r>
       <w:r>
         <w:rPr>
+          <w:rFonts w:ascii="Arial" w:hAnsi="Arial" w:cs="Arial"/>
           <w:color w:val="000000"/>
           <w:sz w:val="18"/>
           <w:highlight w:val="lightGray"/>
@@ -700,6 +782,7 @@
       </w:r>
       <w:r>
         <w:rPr>
+          <w:rFonts w:ascii="Arial" w:hAnsi="Arial" w:cs="Arial"/>
           <w:b/>
           <w:color w:val="000000"/>
           <w:sz w:val="18"/>
@@ -709,6 +792,7 @@
       </w:r>
       <w:r>
         <w:rPr>
+          <w:rFonts w:ascii="Arial" w:hAnsi="Arial" w:cs="Arial"/>
           <w:color w:val="000000"/>
           <w:sz w:val="18"/>
           <w:highlight w:val="lightGray"/>
@@ -887,6 +971,7 @@
     <w:p>
       <w:r>
         <w:rPr>
+          <w:rFonts w:ascii="Arial" w:hAnsi="Arial" w:cs="Arial"/>
           <w:b/>
           <w:color w:val="000000"/>
           <w:sz w:val="18"/>
@@ -896,14 +981,36 @@
       </w:r>
       <w:r>
         <w:rPr>
-          <w:color w:val="000000"/>
-          <w:sz w:val="18"/>
-          <w:highlight w:val="lightGray"/>
-        </w:rPr>
-        <w:t xml:space="preserve">: Persons Table -&gt; ID Column: 1, Name_En Column: Motasem Essam] -&gt; </w:t>
-      </w:r>
-      <w:r>
-        <w:rPr>
+          <w:rFonts w:ascii="Arial" w:hAnsi="Arial" w:cs="Arial"/>
+          <w:color w:val="000000"/>
+          <w:sz w:val="18"/>
+          <w:highlight w:val="lightGray"/>
+        </w:rPr>
+        <w:t xml:space="preserve">: Persons Table -&gt; ID Column: 1, </w:t>
+      </w:r>
+      <w:proofErr w:type="spellStart"/>
+      <w:r>
+        <w:rPr>
+          <w:rFonts w:ascii="Arial" w:hAnsi="Arial" w:cs="Arial"/>
+          <w:color w:val="000000"/>
+          <w:sz w:val="18"/>
+          <w:highlight w:val="lightGray"/>
+        </w:rPr>
+        <w:t>Name_En</w:t>
+      </w:r>
+      <w:proofErr w:type="spellEnd"/>
+      <w:r>
+        <w:rPr>
+          <w:rFonts w:ascii="Arial" w:hAnsi="Arial" w:cs="Arial"/>
+          <w:color w:val="000000"/>
+          <w:sz w:val="18"/>
+          <w:highlight w:val="lightGray"/>
+        </w:rPr>
+        <w:t xml:space="preserve"> Column: Motasem Essam] -&gt; </w:t>
+      </w:r>
+      <w:r>
+        <w:rPr>
+          <w:rFonts w:ascii="Arial" w:hAnsi="Arial" w:cs="Arial"/>
           <w:b/>
           <w:color w:val="000000"/>
           <w:sz w:val="18"/>
@@ -913,6 +1020,7 @@
       </w:r>
       <w:r>
         <w:rPr>
+          <w:rFonts w:ascii="Arial" w:hAnsi="Arial" w:cs="Arial"/>
           <w:color w:val="000000"/>
           <w:sz w:val="18"/>
           <w:highlight w:val="lightGray"/>
@@ -921,6 +1029,7 @@
       </w:r>
       <w:r>
         <w:rPr>
+          <w:rFonts w:ascii="Arial" w:hAnsi="Arial" w:cs="Arial"/>
           <w:b/>
           <w:color w:val="000000"/>
           <w:sz w:val="18"/>
@@ -930,6 +1039,7 @@
       </w:r>
       <w:r>
         <w:rPr>
+          <w:rFonts w:ascii="Arial" w:hAnsi="Arial" w:cs="Arial"/>
           <w:color w:val="000000"/>
           <w:sz w:val="18"/>
           <w:highlight w:val="lightGray"/>
@@ -1033,6 +1143,7 @@
         <w:rPr>
           <w:rFonts w:ascii="Roboto Mono" w:eastAsia="Roboto Mono" w:hAnsi="Roboto Mono"/>
         </w:rPr>
+        <w:lastRenderedPageBreak/>
         <w:t>Every database would use completely different commands.</w:t>
       </w:r>
     </w:p>
@@ -1081,6 +1192,7 @@
       </w:pPr>
       <w:r>
         <w:rPr>
+          <w:rFonts w:ascii="Arial" w:hAnsi="Arial" w:cs="Arial"/>
           <w:b/>
           <w:color w:val="000000"/>
           <w:sz w:val="18"/>
@@ -1090,14 +1202,36 @@
       </w:r>
       <w:r>
         <w:rPr>
-          <w:color w:val="000000"/>
-          <w:sz w:val="18"/>
-          <w:highlight w:val="lightGray"/>
-        </w:rPr>
-        <w:t xml:space="preserve">: Persons Table -&gt; ID Column: 1, Name_En Column: Motasem Essam] -&gt; </w:t>
-      </w:r>
-      <w:r>
-        <w:rPr>
+          <w:rFonts w:ascii="Arial" w:hAnsi="Arial" w:cs="Arial"/>
+          <w:color w:val="000000"/>
+          <w:sz w:val="18"/>
+          <w:highlight w:val="lightGray"/>
+        </w:rPr>
+        <w:t xml:space="preserve">: Persons Table -&gt; ID Column: 1, </w:t>
+      </w:r>
+      <w:proofErr w:type="spellStart"/>
+      <w:r>
+        <w:rPr>
+          <w:rFonts w:ascii="Arial" w:hAnsi="Arial" w:cs="Arial"/>
+          <w:color w:val="000000"/>
+          <w:sz w:val="18"/>
+          <w:highlight w:val="lightGray"/>
+        </w:rPr>
+        <w:t>Name_En</w:t>
+      </w:r>
+      <w:proofErr w:type="spellEnd"/>
+      <w:r>
+        <w:rPr>
+          <w:rFonts w:ascii="Arial" w:hAnsi="Arial" w:cs="Arial"/>
+          <w:color w:val="000000"/>
+          <w:sz w:val="18"/>
+          <w:highlight w:val="lightGray"/>
+        </w:rPr>
+        <w:t xml:space="preserve"> Column: Motasem Essam] -&gt; </w:t>
+      </w:r>
+      <w:r>
+        <w:rPr>
+          <w:rFonts w:ascii="Arial" w:hAnsi="Arial" w:cs="Arial"/>
           <w:b/>
           <w:color w:val="000000"/>
           <w:sz w:val="18"/>
@@ -1107,6 +1241,7 @@
       </w:r>
       <w:r>
         <w:rPr>
+          <w:rFonts w:ascii="Arial" w:hAnsi="Arial" w:cs="Arial"/>
           <w:color w:val="000000"/>
           <w:sz w:val="18"/>
           <w:highlight w:val="lightGray"/>
@@ -1115,6 +1250,7 @@
       </w:r>
       <w:r>
         <w:rPr>
+          <w:rFonts w:ascii="Arial" w:hAnsi="Arial" w:cs="Arial"/>
           <w:b/>
           <w:color w:val="000000"/>
           <w:sz w:val="18"/>
@@ -1124,6 +1260,7 @@
       </w:r>
       <w:r>
         <w:rPr>
+          <w:rFonts w:ascii="Arial" w:hAnsi="Arial" w:cs="Arial"/>
           <w:color w:val="000000"/>
           <w:sz w:val="18"/>
           <w:highlight w:val="lightGray"/>
@@ -1277,6 +1414,7 @@
     <w:p>
       <w:r>
         <w:rPr>
+          <w:rFonts w:ascii="Arial" w:hAnsi="Arial" w:cs="Arial"/>
           <w:b/>
           <w:color w:val="000000"/>
           <w:sz w:val="18"/>
@@ -1286,14 +1424,36 @@
       </w:r>
       <w:r>
         <w:rPr>
-          <w:color w:val="000000"/>
-          <w:sz w:val="18"/>
-          <w:highlight w:val="lightGray"/>
-        </w:rPr>
-        <w:t xml:space="preserve">: Persons Table -&gt; ID Column: 1, Name_En Column: Motasem Essam] -&gt; </w:t>
-      </w:r>
-      <w:r>
-        <w:rPr>
+          <w:rFonts w:ascii="Arial" w:hAnsi="Arial" w:cs="Arial"/>
+          <w:color w:val="000000"/>
+          <w:sz w:val="18"/>
+          <w:highlight w:val="lightGray"/>
+        </w:rPr>
+        <w:t xml:space="preserve">: Persons Table -&gt; ID Column: 1, </w:t>
+      </w:r>
+      <w:proofErr w:type="spellStart"/>
+      <w:r>
+        <w:rPr>
+          <w:rFonts w:ascii="Arial" w:hAnsi="Arial" w:cs="Arial"/>
+          <w:color w:val="000000"/>
+          <w:sz w:val="18"/>
+          <w:highlight w:val="lightGray"/>
+        </w:rPr>
+        <w:t>Name_En</w:t>
+      </w:r>
+      <w:proofErr w:type="spellEnd"/>
+      <w:r>
+        <w:rPr>
+          <w:rFonts w:ascii="Arial" w:hAnsi="Arial" w:cs="Arial"/>
+          <w:color w:val="000000"/>
+          <w:sz w:val="18"/>
+          <w:highlight w:val="lightGray"/>
+        </w:rPr>
+        <w:t xml:space="preserve"> Column: Motasem Essam] -&gt; </w:t>
+      </w:r>
+      <w:r>
+        <w:rPr>
+          <w:rFonts w:ascii="Arial" w:hAnsi="Arial" w:cs="Arial"/>
           <w:b/>
           <w:color w:val="000000"/>
           <w:sz w:val="18"/>
@@ -1303,6 +1463,7 @@
       </w:r>
       <w:r>
         <w:rPr>
+          <w:rFonts w:ascii="Arial" w:hAnsi="Arial" w:cs="Arial"/>
           <w:color w:val="000000"/>
           <w:sz w:val="18"/>
           <w:highlight w:val="lightGray"/>
@@ -1311,6 +1472,7 @@
       </w:r>
       <w:r>
         <w:rPr>
+          <w:rFonts w:ascii="Arial" w:hAnsi="Arial" w:cs="Arial"/>
           <w:b/>
           <w:color w:val="000000"/>
           <w:sz w:val="18"/>
@@ -1320,6 +1482,7 @@
       </w:r>
       <w:r>
         <w:rPr>
+          <w:rFonts w:ascii="Arial" w:hAnsi="Arial" w:cs="Arial"/>
           <w:color w:val="000000"/>
           <w:sz w:val="18"/>
           <w:highlight w:val="lightGray"/>
@@ -1463,6 +1626,7 @@
         <w:rPr>
           <w:rFonts w:ascii="Roboto Mono" w:eastAsia="Roboto Mono" w:hAnsi="Roboto Mono"/>
         </w:rPr>
+        <w:lastRenderedPageBreak/>
         <w:t>SQL Standard</w:t>
       </w:r>
     </w:p>
@@ -1557,6 +1721,7 @@
     <w:p>
       <w:r>
         <w:rPr>
+          <w:rFonts w:ascii="Arial" w:hAnsi="Arial" w:cs="Arial"/>
           <w:b/>
           <w:color w:val="000000"/>
           <w:sz w:val="18"/>
@@ -1566,14 +1731,36 @@
       </w:r>
       <w:r>
         <w:rPr>
-          <w:color w:val="000000"/>
-          <w:sz w:val="18"/>
-          <w:highlight w:val="lightGray"/>
-        </w:rPr>
-        <w:t xml:space="preserve">: Persons Table -&gt; ID Column: 1, Name_En Column: Motasem Essam] -&gt; </w:t>
-      </w:r>
-      <w:r>
-        <w:rPr>
+          <w:rFonts w:ascii="Arial" w:hAnsi="Arial" w:cs="Arial"/>
+          <w:color w:val="000000"/>
+          <w:sz w:val="18"/>
+          <w:highlight w:val="lightGray"/>
+        </w:rPr>
+        <w:t xml:space="preserve">: Persons Table -&gt; ID Column: 1, </w:t>
+      </w:r>
+      <w:proofErr w:type="spellStart"/>
+      <w:r>
+        <w:rPr>
+          <w:rFonts w:ascii="Arial" w:hAnsi="Arial" w:cs="Arial"/>
+          <w:color w:val="000000"/>
+          <w:sz w:val="18"/>
+          <w:highlight w:val="lightGray"/>
+        </w:rPr>
+        <w:t>Name_En</w:t>
+      </w:r>
+      <w:proofErr w:type="spellEnd"/>
+      <w:r>
+        <w:rPr>
+          <w:rFonts w:ascii="Arial" w:hAnsi="Arial" w:cs="Arial"/>
+          <w:color w:val="000000"/>
+          <w:sz w:val="18"/>
+          <w:highlight w:val="lightGray"/>
+        </w:rPr>
+        <w:t xml:space="preserve"> Column: Motasem Essam] -&gt; </w:t>
+      </w:r>
+      <w:r>
+        <w:rPr>
+          <w:rFonts w:ascii="Arial" w:hAnsi="Arial" w:cs="Arial"/>
           <w:b/>
           <w:color w:val="000000"/>
           <w:sz w:val="18"/>
@@ -1583,6 +1770,7 @@
       </w:r>
       <w:r>
         <w:rPr>
+          <w:rFonts w:ascii="Arial" w:hAnsi="Arial" w:cs="Arial"/>
           <w:color w:val="000000"/>
           <w:sz w:val="18"/>
           <w:highlight w:val="lightGray"/>
@@ -1591,6 +1779,7 @@
       </w:r>
       <w:r>
         <w:rPr>
+          <w:rFonts w:ascii="Arial" w:hAnsi="Arial" w:cs="Arial"/>
           <w:b/>
           <w:color w:val="000000"/>
           <w:sz w:val="18"/>
@@ -1600,6 +1789,7 @@
       </w:r>
       <w:r>
         <w:rPr>
+          <w:rFonts w:ascii="Arial" w:hAnsi="Arial" w:cs="Arial"/>
           <w:color w:val="000000"/>
           <w:sz w:val="18"/>
           <w:highlight w:val="lightGray"/>
@@ -1836,6 +2026,7 @@
       </w:pPr>
       <w:r>
         <w:rPr>
+          <w:rFonts w:ascii="Arial" w:hAnsi="Arial" w:cs="Arial"/>
           <w:b/>
           <w:color w:val="000000"/>
           <w:sz w:val="18"/>
@@ -1845,14 +2036,36 @@
       </w:r>
       <w:r>
         <w:rPr>
-          <w:color w:val="000000"/>
-          <w:sz w:val="18"/>
-          <w:highlight w:val="lightGray"/>
-        </w:rPr>
-        <w:t xml:space="preserve">: Persons Table -&gt; ID Column: 1, Name_En Column: Motasem Essam] -&gt; </w:t>
-      </w:r>
-      <w:r>
-        <w:rPr>
+          <w:rFonts w:ascii="Arial" w:hAnsi="Arial" w:cs="Arial"/>
+          <w:color w:val="000000"/>
+          <w:sz w:val="18"/>
+          <w:highlight w:val="lightGray"/>
+        </w:rPr>
+        <w:t xml:space="preserve">: Persons Table -&gt; ID Column: 1, </w:t>
+      </w:r>
+      <w:proofErr w:type="spellStart"/>
+      <w:r>
+        <w:rPr>
+          <w:rFonts w:ascii="Arial" w:hAnsi="Arial" w:cs="Arial"/>
+          <w:color w:val="000000"/>
+          <w:sz w:val="18"/>
+          <w:highlight w:val="lightGray"/>
+        </w:rPr>
+        <w:t>Name_En</w:t>
+      </w:r>
+      <w:proofErr w:type="spellEnd"/>
+      <w:r>
+        <w:rPr>
+          <w:rFonts w:ascii="Arial" w:hAnsi="Arial" w:cs="Arial"/>
+          <w:color w:val="000000"/>
+          <w:sz w:val="18"/>
+          <w:highlight w:val="lightGray"/>
+        </w:rPr>
+        <w:t xml:space="preserve"> Column: Motasem Essam] -&gt; </w:t>
+      </w:r>
+      <w:r>
+        <w:rPr>
+          <w:rFonts w:ascii="Arial" w:hAnsi="Arial" w:cs="Arial"/>
           <w:b/>
           <w:color w:val="000000"/>
           <w:sz w:val="18"/>
@@ -1862,6 +2075,7 @@
       </w:r>
       <w:r>
         <w:rPr>
+          <w:rFonts w:ascii="Arial" w:hAnsi="Arial" w:cs="Arial"/>
           <w:color w:val="000000"/>
           <w:sz w:val="18"/>
           <w:highlight w:val="lightGray"/>
@@ -1870,6 +2084,7 @@
       </w:r>
       <w:r>
         <w:rPr>
+          <w:rFonts w:ascii="Arial" w:hAnsi="Arial" w:cs="Arial"/>
           <w:b/>
           <w:color w:val="000000"/>
           <w:sz w:val="18"/>
@@ -1879,6 +2094,7 @@
       </w:r>
       <w:r>
         <w:rPr>
+          <w:rFonts w:ascii="Arial" w:hAnsi="Arial" w:cs="Arial"/>
           <w:color w:val="000000"/>
           <w:sz w:val="18"/>
           <w:highlight w:val="lightGray"/>
@@ -1891,6 +2107,7 @@
         <w:rPr>
           <w:noProof/>
         </w:rPr>
+        <w:lastRenderedPageBreak/>
         <w:drawing>
           <wp:inline distT="0" distB="0" distL="0" distR="0" wp14:anchorId="6BE664AB" wp14:editId="00B0D994">
             <wp:extent cx="5943600" cy="3322320"/>
@@ -2450,12 +2667,14 @@
         <w:pStyle w:val="Heading3"/>
       </w:pPr>
       <w:r>
+        <w:lastRenderedPageBreak/>
         <w:t>What ANSI/ISO Standardizes</w:t>
       </w:r>
     </w:p>
     <w:p>
       <w:r>
         <w:rPr>
+          <w:rFonts w:ascii="Arial" w:hAnsi="Arial" w:cs="Arial"/>
           <w:b/>
           <w:color w:val="000000"/>
           <w:sz w:val="18"/>
@@ -2465,14 +2684,36 @@
       </w:r>
       <w:r>
         <w:rPr>
-          <w:color w:val="000000"/>
-          <w:sz w:val="18"/>
-          <w:highlight w:val="lightGray"/>
-        </w:rPr>
-        <w:t xml:space="preserve">: Persons Table -&gt; ID Column: 1, Name_En Column: Motasem Essam] -&gt; </w:t>
-      </w:r>
-      <w:r>
-        <w:rPr>
+          <w:rFonts w:ascii="Arial" w:hAnsi="Arial" w:cs="Arial"/>
+          <w:color w:val="000000"/>
+          <w:sz w:val="18"/>
+          <w:highlight w:val="lightGray"/>
+        </w:rPr>
+        <w:t xml:space="preserve">: Persons Table -&gt; ID Column: 1, </w:t>
+      </w:r>
+      <w:proofErr w:type="spellStart"/>
+      <w:r>
+        <w:rPr>
+          <w:rFonts w:ascii="Arial" w:hAnsi="Arial" w:cs="Arial"/>
+          <w:color w:val="000000"/>
+          <w:sz w:val="18"/>
+          <w:highlight w:val="lightGray"/>
+        </w:rPr>
+        <w:t>Name_En</w:t>
+      </w:r>
+      <w:proofErr w:type="spellEnd"/>
+      <w:r>
+        <w:rPr>
+          <w:rFonts w:ascii="Arial" w:hAnsi="Arial" w:cs="Arial"/>
+          <w:color w:val="000000"/>
+          <w:sz w:val="18"/>
+          <w:highlight w:val="lightGray"/>
+        </w:rPr>
+        <w:t xml:space="preserve"> Column: Motasem Essam] -&gt; </w:t>
+      </w:r>
+      <w:r>
+        <w:rPr>
+          <w:rFonts w:ascii="Arial" w:hAnsi="Arial" w:cs="Arial"/>
           <w:b/>
           <w:color w:val="000000"/>
           <w:sz w:val="18"/>
@@ -2482,6 +2723,7 @@
       </w:r>
       <w:r>
         <w:rPr>
+          <w:rFonts w:ascii="Arial" w:hAnsi="Arial" w:cs="Arial"/>
           <w:color w:val="000000"/>
           <w:sz w:val="18"/>
           <w:highlight w:val="lightGray"/>
@@ -2490,6 +2732,7 @@
       </w:r>
       <w:r>
         <w:rPr>
+          <w:rFonts w:ascii="Arial" w:hAnsi="Arial" w:cs="Arial"/>
           <w:b/>
           <w:color w:val="000000"/>
           <w:sz w:val="18"/>
@@ -2499,6 +2742,7 @@
       </w:r>
       <w:r>
         <w:rPr>
+          <w:rFonts w:ascii="Arial" w:hAnsi="Arial" w:cs="Arial"/>
           <w:color w:val="000000"/>
           <w:sz w:val="18"/>
           <w:highlight w:val="lightGray"/>
@@ -2834,6 +3078,7 @@
         <w:rPr>
           <w:noProof/>
         </w:rPr>
+        <w:lastRenderedPageBreak/>
         <w:drawing>
           <wp:inline distT="0" distB="0" distL="0" distR="0" wp14:anchorId="4DE3F933" wp14:editId="3DDBFA26">
             <wp:extent cx="5943600" cy="1264920"/>
@@ -3208,6 +3453,7 @@
         <w:rPr>
           <w:rFonts w:ascii="Roboto Mono" w:eastAsia="Roboto Mono" w:hAnsi="Roboto Mono"/>
         </w:rPr>
+        <w:lastRenderedPageBreak/>
         <w:t>LEFT JOIN</w:t>
       </w:r>
     </w:p>
@@ -3250,6 +3496,7 @@
     <w:p>
       <w:r>
         <w:rPr>
+          <w:rFonts w:ascii="Arial" w:hAnsi="Arial" w:cs="Arial"/>
           <w:b/>
           <w:color w:val="000000"/>
           <w:sz w:val="18"/>
@@ -3259,14 +3506,36 @@
       </w:r>
       <w:r>
         <w:rPr>
-          <w:color w:val="000000"/>
-          <w:sz w:val="18"/>
-          <w:highlight w:val="lightGray"/>
-        </w:rPr>
-        <w:t xml:space="preserve">: Persons Table -&gt; ID Column: 1, Name_En Column: Motasem Essam] -&gt; </w:t>
-      </w:r>
-      <w:r>
-        <w:rPr>
+          <w:rFonts w:ascii="Arial" w:hAnsi="Arial" w:cs="Arial"/>
+          <w:color w:val="000000"/>
+          <w:sz w:val="18"/>
+          <w:highlight w:val="lightGray"/>
+        </w:rPr>
+        <w:t xml:space="preserve">: Persons Table -&gt; ID Column: 1, </w:t>
+      </w:r>
+      <w:proofErr w:type="spellStart"/>
+      <w:r>
+        <w:rPr>
+          <w:rFonts w:ascii="Arial" w:hAnsi="Arial" w:cs="Arial"/>
+          <w:color w:val="000000"/>
+          <w:sz w:val="18"/>
+          <w:highlight w:val="lightGray"/>
+        </w:rPr>
+        <w:t>Name_En</w:t>
+      </w:r>
+      <w:proofErr w:type="spellEnd"/>
+      <w:r>
+        <w:rPr>
+          <w:rFonts w:ascii="Arial" w:hAnsi="Arial" w:cs="Arial"/>
+          <w:color w:val="000000"/>
+          <w:sz w:val="18"/>
+          <w:highlight w:val="lightGray"/>
+        </w:rPr>
+        <w:t xml:space="preserve"> Column: Motasem Essam] -&gt; </w:t>
+      </w:r>
+      <w:r>
+        <w:rPr>
+          <w:rFonts w:ascii="Arial" w:hAnsi="Arial" w:cs="Arial"/>
           <w:b/>
           <w:color w:val="000000"/>
           <w:sz w:val="18"/>
@@ -3276,6 +3545,7 @@
       </w:r>
       <w:r>
         <w:rPr>
+          <w:rFonts w:ascii="Arial" w:hAnsi="Arial" w:cs="Arial"/>
           <w:color w:val="000000"/>
           <w:sz w:val="18"/>
           <w:highlight w:val="lightGray"/>
@@ -3284,6 +3554,7 @@
       </w:r>
       <w:r>
         <w:rPr>
+          <w:rFonts w:ascii="Arial" w:hAnsi="Arial" w:cs="Arial"/>
           <w:b/>
           <w:color w:val="000000"/>
           <w:sz w:val="18"/>
@@ -3293,6 +3564,7 @@
       </w:r>
       <w:r>
         <w:rPr>
+          <w:rFonts w:ascii="Arial" w:hAnsi="Arial" w:cs="Arial"/>
           <w:color w:val="000000"/>
           <w:sz w:val="18"/>
           <w:highlight w:val="lightGray"/>
@@ -3670,6 +3942,7 @@
         <w:rPr>
           <w:rFonts w:ascii="Roboto Mono" w:eastAsia="Roboto Mono" w:hAnsi="Roboto Mono"/>
         </w:rPr>
+        <w:lastRenderedPageBreak/>
         <w:t>TOP 10</w:t>
       </w:r>
     </w:p>
@@ -3819,6 +4092,7 @@
       </w:pPr>
       <w:r>
         <w:rPr>
+          <w:rFonts w:ascii="Arial" w:hAnsi="Arial" w:cs="Arial"/>
           <w:b/>
           <w:color w:val="000000"/>
           <w:sz w:val="18"/>
@@ -3828,14 +4102,36 @@
       </w:r>
       <w:r>
         <w:rPr>
-          <w:color w:val="000000"/>
-          <w:sz w:val="18"/>
-          <w:highlight w:val="lightGray"/>
-        </w:rPr>
-        <w:t xml:space="preserve">: Persons Table -&gt; ID Column: 1, Name_En Column: Motasem Essam] -&gt; </w:t>
-      </w:r>
-      <w:r>
-        <w:rPr>
+          <w:rFonts w:ascii="Arial" w:hAnsi="Arial" w:cs="Arial"/>
+          <w:color w:val="000000"/>
+          <w:sz w:val="18"/>
+          <w:highlight w:val="lightGray"/>
+        </w:rPr>
+        <w:t xml:space="preserve">: Persons Table -&gt; ID Column: 1, </w:t>
+      </w:r>
+      <w:proofErr w:type="spellStart"/>
+      <w:r>
+        <w:rPr>
+          <w:rFonts w:ascii="Arial" w:hAnsi="Arial" w:cs="Arial"/>
+          <w:color w:val="000000"/>
+          <w:sz w:val="18"/>
+          <w:highlight w:val="lightGray"/>
+        </w:rPr>
+        <w:t>Name_En</w:t>
+      </w:r>
+      <w:proofErr w:type="spellEnd"/>
+      <w:r>
+        <w:rPr>
+          <w:rFonts w:ascii="Arial" w:hAnsi="Arial" w:cs="Arial"/>
+          <w:color w:val="000000"/>
+          <w:sz w:val="18"/>
+          <w:highlight w:val="lightGray"/>
+        </w:rPr>
+        <w:t xml:space="preserve"> Column: Motasem Essam] -&gt; </w:t>
+      </w:r>
+      <w:r>
+        <w:rPr>
+          <w:rFonts w:ascii="Arial" w:hAnsi="Arial" w:cs="Arial"/>
           <w:b/>
           <w:color w:val="000000"/>
           <w:sz w:val="18"/>
@@ -3845,6 +4141,7 @@
       </w:r>
       <w:r>
         <w:rPr>
+          <w:rFonts w:ascii="Arial" w:hAnsi="Arial" w:cs="Arial"/>
           <w:color w:val="000000"/>
           <w:sz w:val="18"/>
           <w:highlight w:val="lightGray"/>
@@ -3853,6 +4150,7 @@
       </w:r>
       <w:r>
         <w:rPr>
+          <w:rFonts w:ascii="Arial" w:hAnsi="Arial" w:cs="Arial"/>
           <w:b/>
           <w:color w:val="000000"/>
           <w:sz w:val="18"/>
@@ -3862,6 +4160,7 @@
       </w:r>
       <w:r>
         <w:rPr>
+          <w:rFonts w:ascii="Arial" w:hAnsi="Arial" w:cs="Arial"/>
           <w:color w:val="000000"/>
           <w:sz w:val="18"/>
           <w:highlight w:val="lightGray"/>
@@ -4299,6 +4598,7 @@
               <w:rPr>
                 <w:rFonts w:ascii="Roboto Mono" w:eastAsia="Roboto Mono" w:hAnsi="Roboto Mono"/>
               </w:rPr>
+              <w:lastRenderedPageBreak/>
               <w:t>LIMIT</w:t>
             </w:r>
           </w:p>
@@ -4577,6 +4877,7 @@
       </w:pPr>
       <w:r>
         <w:rPr>
+          <w:rFonts w:ascii="Arial" w:hAnsi="Arial" w:cs="Arial"/>
           <w:b/>
           <w:color w:val="000000"/>
           <w:sz w:val="18"/>
@@ -4586,14 +4887,36 @@
       </w:r>
       <w:r>
         <w:rPr>
-          <w:color w:val="000000"/>
-          <w:sz w:val="18"/>
-          <w:highlight w:val="lightGray"/>
-        </w:rPr>
-        <w:t xml:space="preserve">: Persons Table -&gt; ID Column: 1, Name_En Column: Motasem Essam] -&gt; </w:t>
-      </w:r>
-      <w:r>
-        <w:rPr>
+          <w:rFonts w:ascii="Arial" w:hAnsi="Arial" w:cs="Arial"/>
+          <w:color w:val="000000"/>
+          <w:sz w:val="18"/>
+          <w:highlight w:val="lightGray"/>
+        </w:rPr>
+        <w:t xml:space="preserve">: Persons Table -&gt; ID Column: 1, </w:t>
+      </w:r>
+      <w:proofErr w:type="spellStart"/>
+      <w:r>
+        <w:rPr>
+          <w:rFonts w:ascii="Arial" w:hAnsi="Arial" w:cs="Arial"/>
+          <w:color w:val="000000"/>
+          <w:sz w:val="18"/>
+          <w:highlight w:val="lightGray"/>
+        </w:rPr>
+        <w:t>Name_En</w:t>
+      </w:r>
+      <w:proofErr w:type="spellEnd"/>
+      <w:r>
+        <w:rPr>
+          <w:rFonts w:ascii="Arial" w:hAnsi="Arial" w:cs="Arial"/>
+          <w:color w:val="000000"/>
+          <w:sz w:val="18"/>
+          <w:highlight w:val="lightGray"/>
+        </w:rPr>
+        <w:t xml:space="preserve"> Column: Motasem Essam] -&gt; </w:t>
+      </w:r>
+      <w:r>
+        <w:rPr>
+          <w:rFonts w:ascii="Arial" w:hAnsi="Arial" w:cs="Arial"/>
           <w:b/>
           <w:color w:val="000000"/>
           <w:sz w:val="18"/>
@@ -4603,6 +4926,7 @@
       </w:r>
       <w:r>
         <w:rPr>
+          <w:rFonts w:ascii="Arial" w:hAnsi="Arial" w:cs="Arial"/>
           <w:color w:val="000000"/>
           <w:sz w:val="18"/>
           <w:highlight w:val="lightGray"/>
@@ -4611,6 +4935,7 @@
       </w:r>
       <w:r>
         <w:rPr>
+          <w:rFonts w:ascii="Arial" w:hAnsi="Arial" w:cs="Arial"/>
           <w:b/>
           <w:color w:val="000000"/>
           <w:sz w:val="18"/>
@@ -4620,6 +4945,7 @@
       </w:r>
       <w:r>
         <w:rPr>
+          <w:rFonts w:ascii="Arial" w:hAnsi="Arial" w:cs="Arial"/>
           <w:color w:val="000000"/>
           <w:sz w:val="18"/>
           <w:highlight w:val="lightGray"/>
@@ -4887,6 +5213,7 @@
     <w:p>
       <w:r>
         <w:rPr>
+          <w:rFonts w:ascii="Arial" w:hAnsi="Arial" w:cs="Arial"/>
           <w:b/>
           <w:color w:val="000000"/>
           <w:sz w:val="18"/>
@@ -4896,14 +5223,36 @@
       </w:r>
       <w:r>
         <w:rPr>
-          <w:color w:val="000000"/>
-          <w:sz w:val="18"/>
-          <w:highlight w:val="lightGray"/>
-        </w:rPr>
-        <w:t xml:space="preserve">: Persons Table -&gt; ID Column: 1, Name_En Column: Motasem Essam] -&gt; </w:t>
-      </w:r>
-      <w:r>
-        <w:rPr>
+          <w:rFonts w:ascii="Arial" w:hAnsi="Arial" w:cs="Arial"/>
+          <w:color w:val="000000"/>
+          <w:sz w:val="18"/>
+          <w:highlight w:val="lightGray"/>
+        </w:rPr>
+        <w:t xml:space="preserve">: Persons Table -&gt; ID Column: 1, </w:t>
+      </w:r>
+      <w:proofErr w:type="spellStart"/>
+      <w:r>
+        <w:rPr>
+          <w:rFonts w:ascii="Arial" w:hAnsi="Arial" w:cs="Arial"/>
+          <w:color w:val="000000"/>
+          <w:sz w:val="18"/>
+          <w:highlight w:val="lightGray"/>
+        </w:rPr>
+        <w:t>Name_En</w:t>
+      </w:r>
+      <w:proofErr w:type="spellEnd"/>
+      <w:r>
+        <w:rPr>
+          <w:rFonts w:ascii="Arial" w:hAnsi="Arial" w:cs="Arial"/>
+          <w:color w:val="000000"/>
+          <w:sz w:val="18"/>
+          <w:highlight w:val="lightGray"/>
+        </w:rPr>
+        <w:t xml:space="preserve"> Column: Motasem Essam] -&gt; </w:t>
+      </w:r>
+      <w:r>
+        <w:rPr>
+          <w:rFonts w:ascii="Arial" w:hAnsi="Arial" w:cs="Arial"/>
           <w:b/>
           <w:color w:val="000000"/>
           <w:sz w:val="18"/>
@@ -4913,6 +5262,7 @@
       </w:r>
       <w:r>
         <w:rPr>
+          <w:rFonts w:ascii="Arial" w:hAnsi="Arial" w:cs="Arial"/>
           <w:color w:val="000000"/>
           <w:sz w:val="18"/>
           <w:highlight w:val="lightGray"/>
@@ -4921,6 +5271,7 @@
       </w:r>
       <w:r>
         <w:rPr>
+          <w:rFonts w:ascii="Arial" w:hAnsi="Arial" w:cs="Arial"/>
           <w:b/>
           <w:color w:val="000000"/>
           <w:sz w:val="18"/>
@@ -4930,6 +5281,7 @@
       </w:r>
       <w:r>
         <w:rPr>
+          <w:rFonts w:ascii="Arial" w:hAnsi="Arial" w:cs="Arial"/>
           <w:color w:val="000000"/>
           <w:sz w:val="18"/>
           <w:highlight w:val="lightGray"/>
@@ -4947,6 +5299,7 @@
         <w:rPr>
           <w:rFonts w:ascii="Roboto Mono" w:eastAsia="Roboto Mono" w:hAnsi="Roboto Mono"/>
         </w:rPr>
+        <w:lastRenderedPageBreak/>
         <w:t>Benefits:</w:t>
       </w:r>
     </w:p>
@@ -5072,6 +5425,7 @@
     <w:p>
       <w:r>
         <w:rPr>
+          <w:rFonts w:ascii="Arial" w:hAnsi="Arial" w:cs="Arial"/>
           <w:b/>
           <w:color w:val="000000"/>
           <w:sz w:val="18"/>
@@ -5081,14 +5435,36 @@
       </w:r>
       <w:r>
         <w:rPr>
-          <w:color w:val="000000"/>
-          <w:sz w:val="18"/>
-          <w:highlight w:val="lightGray"/>
-        </w:rPr>
-        <w:t xml:space="preserve">: Persons Table -&gt; ID Column: 1, Name_En Column: Motasem Essam] -&gt; </w:t>
-      </w:r>
-      <w:r>
-        <w:rPr>
+          <w:rFonts w:ascii="Arial" w:hAnsi="Arial" w:cs="Arial"/>
+          <w:color w:val="000000"/>
+          <w:sz w:val="18"/>
+          <w:highlight w:val="lightGray"/>
+        </w:rPr>
+        <w:t xml:space="preserve">: Persons Table -&gt; ID Column: 1, </w:t>
+      </w:r>
+      <w:proofErr w:type="spellStart"/>
+      <w:r>
+        <w:rPr>
+          <w:rFonts w:ascii="Arial" w:hAnsi="Arial" w:cs="Arial"/>
+          <w:color w:val="000000"/>
+          <w:sz w:val="18"/>
+          <w:highlight w:val="lightGray"/>
+        </w:rPr>
+        <w:t>Name_En</w:t>
+      </w:r>
+      <w:proofErr w:type="spellEnd"/>
+      <w:r>
+        <w:rPr>
+          <w:rFonts w:ascii="Arial" w:hAnsi="Arial" w:cs="Arial"/>
+          <w:color w:val="000000"/>
+          <w:sz w:val="18"/>
+          <w:highlight w:val="lightGray"/>
+        </w:rPr>
+        <w:t xml:space="preserve"> Column: Motasem Essam] -&gt; </w:t>
+      </w:r>
+      <w:r>
+        <w:rPr>
+          <w:rFonts w:ascii="Arial" w:hAnsi="Arial" w:cs="Arial"/>
           <w:b/>
           <w:color w:val="000000"/>
           <w:sz w:val="18"/>
@@ -5098,6 +5474,7 @@
       </w:r>
       <w:r>
         <w:rPr>
+          <w:rFonts w:ascii="Arial" w:hAnsi="Arial" w:cs="Arial"/>
           <w:color w:val="000000"/>
           <w:sz w:val="18"/>
           <w:highlight w:val="lightGray"/>
@@ -5106,6 +5483,7 @@
       </w:r>
       <w:r>
         <w:rPr>
+          <w:rFonts w:ascii="Arial" w:hAnsi="Arial" w:cs="Arial"/>
           <w:b/>
           <w:color w:val="000000"/>
           <w:sz w:val="18"/>
@@ -5115,6 +5493,7 @@
       </w:r>
       <w:r>
         <w:rPr>
+          <w:rFonts w:ascii="Arial" w:hAnsi="Arial" w:cs="Arial"/>
           <w:color w:val="000000"/>
           <w:sz w:val="18"/>
           <w:highlight w:val="lightGray"/>
@@ -5395,6 +5774,7 @@
         <w:rPr>
           <w:rFonts w:ascii="Segoe UI Emoji" w:hAnsi="Segoe UI Emoji" w:cs="Segoe UI Emoji"/>
         </w:rPr>
+        <w:lastRenderedPageBreak/>
         <w:t>🧭</w:t>
       </w:r>
       <w:r>
@@ -5404,6 +5784,7 @@
     <w:p>
       <w:r>
         <w:rPr>
+          <w:rFonts w:ascii="Arial" w:hAnsi="Arial" w:cs="Arial"/>
           <w:b/>
           <w:color w:val="000000"/>
           <w:sz w:val="18"/>
@@ -5413,14 +5794,36 @@
       </w:r>
       <w:r>
         <w:rPr>
-          <w:color w:val="000000"/>
-          <w:sz w:val="18"/>
-          <w:highlight w:val="lightGray"/>
-        </w:rPr>
-        <w:t xml:space="preserve">: Persons Table -&gt; ID Column: 1, Name_En Column: Motasem Essam] -&gt; </w:t>
-      </w:r>
-      <w:r>
-        <w:rPr>
+          <w:rFonts w:ascii="Arial" w:hAnsi="Arial" w:cs="Arial"/>
+          <w:color w:val="000000"/>
+          <w:sz w:val="18"/>
+          <w:highlight w:val="lightGray"/>
+        </w:rPr>
+        <w:t xml:space="preserve">: Persons Table -&gt; ID Column: 1, </w:t>
+      </w:r>
+      <w:proofErr w:type="spellStart"/>
+      <w:r>
+        <w:rPr>
+          <w:rFonts w:ascii="Arial" w:hAnsi="Arial" w:cs="Arial"/>
+          <w:color w:val="000000"/>
+          <w:sz w:val="18"/>
+          <w:highlight w:val="lightGray"/>
+        </w:rPr>
+        <w:t>Name_En</w:t>
+      </w:r>
+      <w:proofErr w:type="spellEnd"/>
+      <w:r>
+        <w:rPr>
+          <w:rFonts w:ascii="Arial" w:hAnsi="Arial" w:cs="Arial"/>
+          <w:color w:val="000000"/>
+          <w:sz w:val="18"/>
+          <w:highlight w:val="lightGray"/>
+        </w:rPr>
+        <w:t xml:space="preserve"> Column: Motasem Essam] -&gt; </w:t>
+      </w:r>
+      <w:r>
+        <w:rPr>
+          <w:rFonts w:ascii="Arial" w:hAnsi="Arial" w:cs="Arial"/>
           <w:b/>
           <w:color w:val="000000"/>
           <w:sz w:val="18"/>
@@ -5430,6 +5833,7 @@
       </w:r>
       <w:r>
         <w:rPr>
+          <w:rFonts w:ascii="Arial" w:hAnsi="Arial" w:cs="Arial"/>
           <w:color w:val="000000"/>
           <w:sz w:val="18"/>
           <w:highlight w:val="lightGray"/>
@@ -5438,6 +5842,7 @@
       </w:r>
       <w:r>
         <w:rPr>
+          <w:rFonts w:ascii="Arial" w:hAnsi="Arial" w:cs="Arial"/>
           <w:b/>
           <w:color w:val="000000"/>
           <w:sz w:val="18"/>
@@ -5447,6 +5852,7 @@
       </w:r>
       <w:r>
         <w:rPr>
+          <w:rFonts w:ascii="Arial" w:hAnsi="Arial" w:cs="Arial"/>
           <w:color w:val="000000"/>
           <w:sz w:val="18"/>
           <w:highlight w:val="lightGray"/>
@@ -5527,6 +5933,7 @@
     <w:p>
       <w:r>
         <w:rPr>
+          <w:rFonts w:ascii="Arial" w:hAnsi="Arial" w:cs="Arial"/>
           <w:b/>
           <w:color w:val="000000"/>
           <w:sz w:val="18"/>
@@ -5536,14 +5943,36 @@
       </w:r>
       <w:r>
         <w:rPr>
-          <w:color w:val="000000"/>
-          <w:sz w:val="18"/>
-          <w:highlight w:val="lightGray"/>
-        </w:rPr>
-        <w:t xml:space="preserve">: Persons Table -&gt; ID Column: 1, Name_En Column: Motasem Essam] -&gt; </w:t>
-      </w:r>
-      <w:r>
-        <w:rPr>
+          <w:rFonts w:ascii="Arial" w:hAnsi="Arial" w:cs="Arial"/>
+          <w:color w:val="000000"/>
+          <w:sz w:val="18"/>
+          <w:highlight w:val="lightGray"/>
+        </w:rPr>
+        <w:t xml:space="preserve">: Persons Table -&gt; ID Column: 1, </w:t>
+      </w:r>
+      <w:proofErr w:type="spellStart"/>
+      <w:r>
+        <w:rPr>
+          <w:rFonts w:ascii="Arial" w:hAnsi="Arial" w:cs="Arial"/>
+          <w:color w:val="000000"/>
+          <w:sz w:val="18"/>
+          <w:highlight w:val="lightGray"/>
+        </w:rPr>
+        <w:t>Name_En</w:t>
+      </w:r>
+      <w:proofErr w:type="spellEnd"/>
+      <w:r>
+        <w:rPr>
+          <w:rFonts w:ascii="Arial" w:hAnsi="Arial" w:cs="Arial"/>
+          <w:color w:val="000000"/>
+          <w:sz w:val="18"/>
+          <w:highlight w:val="lightGray"/>
+        </w:rPr>
+        <w:t xml:space="preserve"> Column: Motasem Essam] -&gt; </w:t>
+      </w:r>
+      <w:r>
+        <w:rPr>
+          <w:rFonts w:ascii="Arial" w:hAnsi="Arial" w:cs="Arial"/>
           <w:b/>
           <w:color w:val="000000"/>
           <w:sz w:val="18"/>
@@ -5553,6 +5982,7 @@
       </w:r>
       <w:r>
         <w:rPr>
+          <w:rFonts w:ascii="Arial" w:hAnsi="Arial" w:cs="Arial"/>
           <w:color w:val="000000"/>
           <w:sz w:val="18"/>
           <w:highlight w:val="lightGray"/>
@@ -5561,6 +5991,7 @@
       </w:r>
       <w:r>
         <w:rPr>
+          <w:rFonts w:ascii="Arial" w:hAnsi="Arial" w:cs="Arial"/>
           <w:b/>
           <w:color w:val="000000"/>
           <w:sz w:val="18"/>
@@ -5570,6 +6001,7 @@
       </w:r>
       <w:r>
         <w:rPr>
+          <w:rFonts w:ascii="Arial" w:hAnsi="Arial" w:cs="Arial"/>
           <w:color w:val="000000"/>
           <w:sz w:val="18"/>
           <w:highlight w:val="lightGray"/>
@@ -5720,6 +6152,7 @@
     <w:p>
       <w:r>
         <w:rPr>
+          <w:rFonts w:ascii="Arial" w:hAnsi="Arial" w:cs="Arial"/>
           <w:b/>
           <w:color w:val="000000"/>
           <w:sz w:val="18"/>
@@ -5729,14 +6162,36 @@
       </w:r>
       <w:r>
         <w:rPr>
-          <w:color w:val="000000"/>
-          <w:sz w:val="18"/>
-          <w:highlight w:val="lightGray"/>
-        </w:rPr>
-        <w:t xml:space="preserve">: Persons Table -&gt; ID Column: 1, Name_En Column: Motasem Essam] -&gt; </w:t>
-      </w:r>
-      <w:r>
-        <w:rPr>
+          <w:rFonts w:ascii="Arial" w:hAnsi="Arial" w:cs="Arial"/>
+          <w:color w:val="000000"/>
+          <w:sz w:val="18"/>
+          <w:highlight w:val="lightGray"/>
+        </w:rPr>
+        <w:t xml:space="preserve">: Persons Table -&gt; ID Column: 1, </w:t>
+      </w:r>
+      <w:proofErr w:type="spellStart"/>
+      <w:r>
+        <w:rPr>
+          <w:rFonts w:ascii="Arial" w:hAnsi="Arial" w:cs="Arial"/>
+          <w:color w:val="000000"/>
+          <w:sz w:val="18"/>
+          <w:highlight w:val="lightGray"/>
+        </w:rPr>
+        <w:t>Name_En</w:t>
+      </w:r>
+      <w:proofErr w:type="spellEnd"/>
+      <w:r>
+        <w:rPr>
+          <w:rFonts w:ascii="Arial" w:hAnsi="Arial" w:cs="Arial"/>
+          <w:color w:val="000000"/>
+          <w:sz w:val="18"/>
+          <w:highlight w:val="lightGray"/>
+        </w:rPr>
+        <w:t xml:space="preserve"> Column: Motasem Essam] -&gt; </w:t>
+      </w:r>
+      <w:r>
+        <w:rPr>
+          <w:rFonts w:ascii="Arial" w:hAnsi="Arial" w:cs="Arial"/>
           <w:b/>
           <w:color w:val="000000"/>
           <w:sz w:val="18"/>
@@ -5746,6 +6201,7 @@
       </w:r>
       <w:r>
         <w:rPr>
+          <w:rFonts w:ascii="Arial" w:hAnsi="Arial" w:cs="Arial"/>
           <w:color w:val="000000"/>
           <w:sz w:val="18"/>
           <w:highlight w:val="lightGray"/>
@@ -5754,6 +6210,7 @@
       </w:r>
       <w:r>
         <w:rPr>
+          <w:rFonts w:ascii="Arial" w:hAnsi="Arial" w:cs="Arial"/>
           <w:b/>
           <w:color w:val="000000"/>
           <w:sz w:val="18"/>
@@ -5763,6 +6220,7 @@
       </w:r>
       <w:r>
         <w:rPr>
+          <w:rFonts w:ascii="Arial" w:hAnsi="Arial" w:cs="Arial"/>
           <w:color w:val="000000"/>
           <w:sz w:val="18"/>
           <w:highlight w:val="lightGray"/>
@@ -5801,6 +6259,7 @@
         <w:rPr>
           <w:noProof/>
         </w:rPr>
+        <w:lastRenderedPageBreak/>
         <w:drawing>
           <wp:inline distT="0" distB="0" distL="0" distR="0" wp14:anchorId="3430567B" wp14:editId="3D728699">
             <wp:extent cx="5943600" cy="1091565"/>
@@ -5874,7 +6333,21 @@
         <w:rPr>
           <w:rFonts w:ascii="Roboto Mono" w:eastAsia="Roboto Mono" w:hAnsi="Roboto Mono"/>
         </w:rPr>
-        <w:t xml:space="preserve">    CustomerID INT,</w:t>
+        <w:t xml:space="preserve">    </w:t>
+      </w:r>
+      <w:proofErr w:type="spellStart"/>
+      <w:r>
+        <w:rPr>
+          <w:rFonts w:ascii="Roboto Mono" w:eastAsia="Roboto Mono" w:hAnsi="Roboto Mono"/>
+        </w:rPr>
+        <w:t>CustomerID</w:t>
+      </w:r>
+      <w:proofErr w:type="spellEnd"/>
+      <w:r>
+        <w:rPr>
+          <w:rFonts w:ascii="Roboto Mono" w:eastAsia="Roboto Mono" w:hAnsi="Roboto Mono"/>
+        </w:rPr>
+        <w:t xml:space="preserve"> INT,</w:t>
       </w:r>
     </w:p>
     <w:p>
@@ -6213,6 +6686,7 @@
         <w:rPr>
           <w:noProof/>
         </w:rPr>
+        <w:lastRenderedPageBreak/>
         <w:drawing>
           <wp:inline distT="0" distB="0" distL="0" distR="0" wp14:anchorId="7533FDBF" wp14:editId="669A6BE4">
             <wp:extent cx="5943600" cy="930910"/>
@@ -6299,7 +6773,21 @@
         <w:rPr>
           <w:rFonts w:ascii="Roboto Mono" w:eastAsia="Roboto Mono" w:hAnsi="Roboto Mono"/>
         </w:rPr>
-        <w:t>WHERE CustomerID = 1;</w:t>
+        <w:t xml:space="preserve">WHERE </w:t>
+      </w:r>
+      <w:proofErr w:type="spellStart"/>
+      <w:r>
+        <w:rPr>
+          <w:rFonts w:ascii="Roboto Mono" w:eastAsia="Roboto Mono" w:hAnsi="Roboto Mono"/>
+        </w:rPr>
+        <w:t>CustomerID</w:t>
+      </w:r>
+      <w:proofErr w:type="spellEnd"/>
+      <w:r>
+        <w:rPr>
+          <w:rFonts w:ascii="Roboto Mono" w:eastAsia="Roboto Mono" w:hAnsi="Roboto Mono"/>
+        </w:rPr>
+        <w:t xml:space="preserve"> = 1;</w:t>
       </w:r>
     </w:p>
     <w:p>
@@ -6432,7 +6920,21 @@
         <w:rPr>
           <w:rFonts w:ascii="Roboto Mono" w:eastAsia="Roboto Mono" w:hAnsi="Roboto Mono"/>
         </w:rPr>
-        <w:t>WHERE CustomerID = 1;</w:t>
+        <w:t xml:space="preserve">WHERE </w:t>
+      </w:r>
+      <w:proofErr w:type="spellStart"/>
+      <w:r>
+        <w:rPr>
+          <w:rFonts w:ascii="Roboto Mono" w:eastAsia="Roboto Mono" w:hAnsi="Roboto Mono"/>
+        </w:rPr>
+        <w:t>CustomerID</w:t>
+      </w:r>
+      <w:proofErr w:type="spellEnd"/>
+      <w:r>
+        <w:rPr>
+          <w:rFonts w:ascii="Roboto Mono" w:eastAsia="Roboto Mono" w:hAnsi="Roboto Mono"/>
+        </w:rPr>
+        <w:t xml:space="preserve"> = 1;</w:t>
       </w:r>
     </w:p>
     <w:p>
@@ -6478,8 +6980,14 @@
       </w:r>
     </w:p>
     <w:p>
-      <w:r>
-        <w:rPr>
+      <w:pPr>
+        <w:rPr>
+          <w:rFonts w:ascii="Arial" w:hAnsi="Arial" w:cs="Arial"/>
+        </w:rPr>
+      </w:pPr>
+      <w:r>
+        <w:rPr>
+          <w:rFonts w:ascii="Arial" w:hAnsi="Arial" w:cs="Arial"/>
           <w:b/>
           <w:color w:val="000000"/>
           <w:sz w:val="18"/>
@@ -6489,14 +6997,36 @@
       </w:r>
       <w:r>
         <w:rPr>
-          <w:color w:val="000000"/>
-          <w:sz w:val="18"/>
-          <w:highlight w:val="lightGray"/>
-        </w:rPr>
-        <w:t xml:space="preserve">: Persons Table -&gt; ID Column: 1, Name_En Column: Motasem Essam] -&gt; </w:t>
-      </w:r>
-      <w:r>
-        <w:rPr>
+          <w:rFonts w:ascii="Arial" w:hAnsi="Arial" w:cs="Arial"/>
+          <w:color w:val="000000"/>
+          <w:sz w:val="18"/>
+          <w:highlight w:val="lightGray"/>
+        </w:rPr>
+        <w:t xml:space="preserve">: Persons Table -&gt; ID Column: 1, </w:t>
+      </w:r>
+      <w:proofErr w:type="spellStart"/>
+      <w:r>
+        <w:rPr>
+          <w:rFonts w:ascii="Arial" w:hAnsi="Arial" w:cs="Arial"/>
+          <w:color w:val="000000"/>
+          <w:sz w:val="18"/>
+          <w:highlight w:val="lightGray"/>
+        </w:rPr>
+        <w:t>Name_En</w:t>
+      </w:r>
+      <w:proofErr w:type="spellEnd"/>
+      <w:r>
+        <w:rPr>
+          <w:rFonts w:ascii="Arial" w:hAnsi="Arial" w:cs="Arial"/>
+          <w:color w:val="000000"/>
+          <w:sz w:val="18"/>
+          <w:highlight w:val="lightGray"/>
+        </w:rPr>
+        <w:t xml:space="preserve"> Column: Motasem Essam] -&gt; </w:t>
+      </w:r>
+      <w:r>
+        <w:rPr>
+          <w:rFonts w:ascii="Arial" w:hAnsi="Arial" w:cs="Arial"/>
           <w:b/>
           <w:color w:val="000000"/>
           <w:sz w:val="18"/>
@@ -6506,6 +7036,7 @@
       </w:r>
       <w:r>
         <w:rPr>
+          <w:rFonts w:ascii="Arial" w:hAnsi="Arial" w:cs="Arial"/>
           <w:color w:val="000000"/>
           <w:sz w:val="18"/>
           <w:highlight w:val="lightGray"/>
@@ -6514,6 +7045,7 @@
       </w:r>
       <w:r>
         <w:rPr>
+          <w:rFonts w:ascii="Arial" w:hAnsi="Arial" w:cs="Arial"/>
           <w:b/>
           <w:color w:val="000000"/>
           <w:sz w:val="18"/>
@@ -6523,6 +7055,7 @@
       </w:r>
       <w:r>
         <w:rPr>
+          <w:rFonts w:ascii="Arial" w:hAnsi="Arial" w:cs="Arial"/>
           <w:color w:val="000000"/>
           <w:sz w:val="18"/>
           <w:highlight w:val="lightGray"/>
@@ -6644,14 +7177,17 @@
                 <w:bCs/>
               </w:rPr>
             </w:pPr>
+            <w:proofErr w:type="spellStart"/>
             <w:r>
               <w:rPr>
                 <w:rFonts w:ascii="Roboto Mono" w:eastAsia="Roboto Mono" w:hAnsi="Roboto Mono"/>
                 <w:b/>
                 <w:bCs/>
               </w:rPr>
+              <w:lastRenderedPageBreak/>
               <w:t>CustomerID</w:t>
             </w:r>
+            <w:proofErr w:type="spellEnd"/>
           </w:p>
         </w:tc>
         <w:tc>
@@ -7105,6 +7641,7 @@
     <w:p>
       <w:r>
         <w:rPr>
+          <w:rFonts w:ascii="Arial" w:hAnsi="Arial" w:cs="Arial"/>
           <w:b/>
           <w:color w:val="000000"/>
           <w:sz w:val="18"/>
@@ -7114,14 +7651,36 @@
       </w:r>
       <w:r>
         <w:rPr>
-          <w:color w:val="000000"/>
-          <w:sz w:val="18"/>
-          <w:highlight w:val="lightGray"/>
-        </w:rPr>
-        <w:t xml:space="preserve">: Persons Table -&gt; ID Column: 1, Name_En Column: Motasem Essam] -&gt; </w:t>
-      </w:r>
-      <w:r>
-        <w:rPr>
+          <w:rFonts w:ascii="Arial" w:hAnsi="Arial" w:cs="Arial"/>
+          <w:color w:val="000000"/>
+          <w:sz w:val="18"/>
+          <w:highlight w:val="lightGray"/>
+        </w:rPr>
+        <w:t xml:space="preserve">: Persons Table -&gt; ID Column: 1, </w:t>
+      </w:r>
+      <w:proofErr w:type="spellStart"/>
+      <w:r>
+        <w:rPr>
+          <w:rFonts w:ascii="Arial" w:hAnsi="Arial" w:cs="Arial"/>
+          <w:color w:val="000000"/>
+          <w:sz w:val="18"/>
+          <w:highlight w:val="lightGray"/>
+        </w:rPr>
+        <w:t>Name_En</w:t>
+      </w:r>
+      <w:proofErr w:type="spellEnd"/>
+      <w:r>
+        <w:rPr>
+          <w:rFonts w:ascii="Arial" w:hAnsi="Arial" w:cs="Arial"/>
+          <w:color w:val="000000"/>
+          <w:sz w:val="18"/>
+          <w:highlight w:val="lightGray"/>
+        </w:rPr>
+        <w:t xml:space="preserve"> Column: Motasem Essam] -&gt; </w:t>
+      </w:r>
+      <w:r>
+        <w:rPr>
+          <w:rFonts w:ascii="Arial" w:hAnsi="Arial" w:cs="Arial"/>
           <w:b/>
           <w:color w:val="000000"/>
           <w:sz w:val="18"/>
@@ -7131,6 +7690,7 @@
       </w:r>
       <w:r>
         <w:rPr>
+          <w:rFonts w:ascii="Arial" w:hAnsi="Arial" w:cs="Arial"/>
           <w:color w:val="000000"/>
           <w:sz w:val="18"/>
           <w:highlight w:val="lightGray"/>
@@ -7139,6 +7699,7 @@
       </w:r>
       <w:r>
         <w:rPr>
+          <w:rFonts w:ascii="Arial" w:hAnsi="Arial" w:cs="Arial"/>
           <w:b/>
           <w:color w:val="000000"/>
           <w:sz w:val="18"/>
@@ -7148,6 +7709,7 @@
       </w:r>
       <w:r>
         <w:rPr>
+          <w:rFonts w:ascii="Arial" w:hAnsi="Arial" w:cs="Arial"/>
           <w:color w:val="000000"/>
           <w:sz w:val="18"/>
           <w:highlight w:val="lightGray"/>
@@ -7186,6 +7748,7 @@
         <w:rPr>
           <w:noProof/>
         </w:rPr>
+        <w:lastRenderedPageBreak/>
         <w:drawing>
           <wp:inline distT="0" distB="0" distL="0" distR="0" wp14:anchorId="5192C453" wp14:editId="06827C6C">
             <wp:extent cx="5943600" cy="814070"/>
@@ -7384,7 +7947,21 @@
         <w:rPr>
           <w:rFonts w:ascii="Roboto Mono" w:eastAsia="Roboto Mono" w:hAnsi="Roboto Mono"/>
         </w:rPr>
-        <w:t xml:space="preserve">    ProductID INT,</w:t>
+        <w:t xml:space="preserve">    </w:t>
+      </w:r>
+      <w:proofErr w:type="spellStart"/>
+      <w:r>
+        <w:rPr>
+          <w:rFonts w:ascii="Roboto Mono" w:eastAsia="Roboto Mono" w:hAnsi="Roboto Mono"/>
+        </w:rPr>
+        <w:t>ProductID</w:t>
+      </w:r>
+      <w:proofErr w:type="spellEnd"/>
+      <w:r>
+        <w:rPr>
+          <w:rFonts w:ascii="Roboto Mono" w:eastAsia="Roboto Mono" w:hAnsi="Roboto Mono"/>
+        </w:rPr>
+        <w:t xml:space="preserve"> INT,</w:t>
       </w:r>
     </w:p>
     <w:p>
@@ -7439,6 +8016,7 @@
     <w:p>
       <w:r>
         <w:rPr>
+          <w:rFonts w:ascii="Arial" w:hAnsi="Arial" w:cs="Arial"/>
           <w:b/>
           <w:color w:val="000000"/>
           <w:sz w:val="18"/>
@@ -7448,14 +8026,36 @@
       </w:r>
       <w:r>
         <w:rPr>
-          <w:color w:val="000000"/>
-          <w:sz w:val="18"/>
-          <w:highlight w:val="lightGray"/>
-        </w:rPr>
-        <w:t xml:space="preserve">: Persons Table -&gt; ID Column: 1, Name_En Column: Motasem Essam] -&gt; </w:t>
-      </w:r>
-      <w:r>
-        <w:rPr>
+          <w:rFonts w:ascii="Arial" w:hAnsi="Arial" w:cs="Arial"/>
+          <w:color w:val="000000"/>
+          <w:sz w:val="18"/>
+          <w:highlight w:val="lightGray"/>
+        </w:rPr>
+        <w:t xml:space="preserve">: Persons Table -&gt; ID Column: 1, </w:t>
+      </w:r>
+      <w:proofErr w:type="spellStart"/>
+      <w:r>
+        <w:rPr>
+          <w:rFonts w:ascii="Arial" w:hAnsi="Arial" w:cs="Arial"/>
+          <w:color w:val="000000"/>
+          <w:sz w:val="18"/>
+          <w:highlight w:val="lightGray"/>
+        </w:rPr>
+        <w:t>Name_En</w:t>
+      </w:r>
+      <w:proofErr w:type="spellEnd"/>
+      <w:r>
+        <w:rPr>
+          <w:rFonts w:ascii="Arial" w:hAnsi="Arial" w:cs="Arial"/>
+          <w:color w:val="000000"/>
+          <w:sz w:val="18"/>
+          <w:highlight w:val="lightGray"/>
+        </w:rPr>
+        <w:t xml:space="preserve"> Column: Motasem Essam] -&gt; </w:t>
+      </w:r>
+      <w:r>
+        <w:rPr>
+          <w:rFonts w:ascii="Arial" w:hAnsi="Arial" w:cs="Arial"/>
           <w:b/>
           <w:color w:val="000000"/>
           <w:sz w:val="18"/>
@@ -7465,6 +8065,7 @@
       </w:r>
       <w:r>
         <w:rPr>
+          <w:rFonts w:ascii="Arial" w:hAnsi="Arial" w:cs="Arial"/>
           <w:color w:val="000000"/>
           <w:sz w:val="18"/>
           <w:highlight w:val="lightGray"/>
@@ -7473,6 +8074,7 @@
       </w:r>
       <w:r>
         <w:rPr>
+          <w:rFonts w:ascii="Arial" w:hAnsi="Arial" w:cs="Arial"/>
           <w:b/>
           <w:color w:val="000000"/>
           <w:sz w:val="18"/>
@@ -7482,6 +8084,7 @@
       </w:r>
       <w:r>
         <w:rPr>
+          <w:rFonts w:ascii="Arial" w:hAnsi="Arial" w:cs="Arial"/>
           <w:color w:val="000000"/>
           <w:sz w:val="18"/>
           <w:highlight w:val="lightGray"/>
@@ -7611,6 +8214,7 @@
         <w:rPr>
           <w:rFonts w:ascii="Roboto Mono" w:eastAsia="Roboto Mono" w:hAnsi="Roboto Mono"/>
         </w:rPr>
+        <w:lastRenderedPageBreak/>
         <w:t>DELETE</w:t>
       </w:r>
     </w:p>
@@ -7739,6 +8343,7 @@
     <w:p>
       <w:r>
         <w:rPr>
+          <w:rFonts w:ascii="Arial" w:hAnsi="Arial" w:cs="Arial"/>
           <w:b/>
           <w:color w:val="000000"/>
           <w:sz w:val="18"/>
@@ -7748,14 +8353,36 @@
       </w:r>
       <w:r>
         <w:rPr>
-          <w:color w:val="000000"/>
-          <w:sz w:val="18"/>
-          <w:highlight w:val="lightGray"/>
-        </w:rPr>
-        <w:t xml:space="preserve">: Persons Table -&gt; ID Column: 1, Name_En Column: Motasem Essam] -&gt; </w:t>
-      </w:r>
-      <w:r>
-        <w:rPr>
+          <w:rFonts w:ascii="Arial" w:hAnsi="Arial" w:cs="Arial"/>
+          <w:color w:val="000000"/>
+          <w:sz w:val="18"/>
+          <w:highlight w:val="lightGray"/>
+        </w:rPr>
+        <w:t xml:space="preserve">: Persons Table -&gt; ID Column: 1, </w:t>
+      </w:r>
+      <w:proofErr w:type="spellStart"/>
+      <w:r>
+        <w:rPr>
+          <w:rFonts w:ascii="Arial" w:hAnsi="Arial" w:cs="Arial"/>
+          <w:color w:val="000000"/>
+          <w:sz w:val="18"/>
+          <w:highlight w:val="lightGray"/>
+        </w:rPr>
+        <w:t>Name_En</w:t>
+      </w:r>
+      <w:proofErr w:type="spellEnd"/>
+      <w:r>
+        <w:rPr>
+          <w:rFonts w:ascii="Arial" w:hAnsi="Arial" w:cs="Arial"/>
+          <w:color w:val="000000"/>
+          <w:sz w:val="18"/>
+          <w:highlight w:val="lightGray"/>
+        </w:rPr>
+        <w:t xml:space="preserve"> Column: Motasem Essam] -&gt; </w:t>
+      </w:r>
+      <w:r>
+        <w:rPr>
+          <w:rFonts w:ascii="Arial" w:hAnsi="Arial" w:cs="Arial"/>
           <w:b/>
           <w:color w:val="000000"/>
           <w:sz w:val="18"/>
@@ -7765,6 +8392,7 @@
       </w:r>
       <w:r>
         <w:rPr>
+          <w:rFonts w:ascii="Arial" w:hAnsi="Arial" w:cs="Arial"/>
           <w:color w:val="000000"/>
           <w:sz w:val="18"/>
           <w:highlight w:val="lightGray"/>
@@ -7773,6 +8401,7 @@
       </w:r>
       <w:r>
         <w:rPr>
+          <w:rFonts w:ascii="Arial" w:hAnsi="Arial" w:cs="Arial"/>
           <w:b/>
           <w:color w:val="000000"/>
           <w:sz w:val="18"/>
@@ -7782,6 +8411,7 @@
       </w:r>
       <w:r>
         <w:rPr>
+          <w:rFonts w:ascii="Arial" w:hAnsi="Arial" w:cs="Arial"/>
           <w:color w:val="000000"/>
           <w:sz w:val="18"/>
           <w:highlight w:val="lightGray"/>
@@ -8000,6 +8630,7 @@
     <w:p>
       <w:r>
         <w:rPr>
+          <w:rFonts w:ascii="Arial" w:hAnsi="Arial" w:cs="Arial"/>
           <w:b/>
           <w:color w:val="000000"/>
           <w:sz w:val="18"/>
@@ -8009,14 +8640,36 @@
       </w:r>
       <w:r>
         <w:rPr>
-          <w:color w:val="000000"/>
-          <w:sz w:val="18"/>
-          <w:highlight w:val="lightGray"/>
-        </w:rPr>
-        <w:t xml:space="preserve">: Persons Table -&gt; ID Column: 1, Name_En Column: Motasem Essam] -&gt; </w:t>
-      </w:r>
-      <w:r>
-        <w:rPr>
+          <w:rFonts w:ascii="Arial" w:hAnsi="Arial" w:cs="Arial"/>
+          <w:color w:val="000000"/>
+          <w:sz w:val="18"/>
+          <w:highlight w:val="lightGray"/>
+        </w:rPr>
+        <w:t xml:space="preserve">: Persons Table -&gt; ID Column: 1, </w:t>
+      </w:r>
+      <w:proofErr w:type="spellStart"/>
+      <w:r>
+        <w:rPr>
+          <w:rFonts w:ascii="Arial" w:hAnsi="Arial" w:cs="Arial"/>
+          <w:color w:val="000000"/>
+          <w:sz w:val="18"/>
+          <w:highlight w:val="lightGray"/>
+        </w:rPr>
+        <w:t>Name_En</w:t>
+      </w:r>
+      <w:proofErr w:type="spellEnd"/>
+      <w:r>
+        <w:rPr>
+          <w:rFonts w:ascii="Arial" w:hAnsi="Arial" w:cs="Arial"/>
+          <w:color w:val="000000"/>
+          <w:sz w:val="18"/>
+          <w:highlight w:val="lightGray"/>
+        </w:rPr>
+        <w:t xml:space="preserve"> Column: Motasem Essam] -&gt; </w:t>
+      </w:r>
+      <w:r>
+        <w:rPr>
+          <w:rFonts w:ascii="Arial" w:hAnsi="Arial" w:cs="Arial"/>
           <w:b/>
           <w:color w:val="000000"/>
           <w:sz w:val="18"/>
@@ -8026,6 +8679,7 @@
       </w:r>
       <w:r>
         <w:rPr>
+          <w:rFonts w:ascii="Arial" w:hAnsi="Arial" w:cs="Arial"/>
           <w:color w:val="000000"/>
           <w:sz w:val="18"/>
           <w:highlight w:val="lightGray"/>
@@ -8034,6 +8688,7 @@
       </w:r>
       <w:r>
         <w:rPr>
+          <w:rFonts w:ascii="Arial" w:hAnsi="Arial" w:cs="Arial"/>
           <w:b/>
           <w:color w:val="000000"/>
           <w:sz w:val="18"/>
@@ -8043,6 +8698,7 @@
       </w:r>
       <w:r>
         <w:rPr>
+          <w:rFonts w:ascii="Arial" w:hAnsi="Arial" w:cs="Arial"/>
           <w:color w:val="000000"/>
           <w:sz w:val="18"/>
           <w:highlight w:val="lightGray"/>
@@ -8086,6 +8742,7 @@
         <w:rPr>
           <w:noProof/>
         </w:rPr>
+        <w:lastRenderedPageBreak/>
         <w:drawing>
           <wp:inline distT="0" distB="0" distL="0" distR="0" wp14:anchorId="70A65A4E" wp14:editId="38E3435E">
             <wp:extent cx="5943600" cy="495935"/>
@@ -8300,6 +8957,7 @@
     <w:p>
       <w:r>
         <w:rPr>
+          <w:rFonts w:ascii="Arial" w:hAnsi="Arial" w:cs="Arial"/>
           <w:b/>
           <w:color w:val="000000"/>
           <w:sz w:val="18"/>
@@ -8309,14 +8967,36 @@
       </w:r>
       <w:r>
         <w:rPr>
-          <w:color w:val="000000"/>
-          <w:sz w:val="18"/>
-          <w:highlight w:val="lightGray"/>
-        </w:rPr>
-        <w:t xml:space="preserve">: Persons Table -&gt; ID Column: 1, Name_En Column: Motasem Essam] -&gt; </w:t>
-      </w:r>
-      <w:r>
-        <w:rPr>
+          <w:rFonts w:ascii="Arial" w:hAnsi="Arial" w:cs="Arial"/>
+          <w:color w:val="000000"/>
+          <w:sz w:val="18"/>
+          <w:highlight w:val="lightGray"/>
+        </w:rPr>
+        <w:t xml:space="preserve">: Persons Table -&gt; ID Column: 1, </w:t>
+      </w:r>
+      <w:proofErr w:type="spellStart"/>
+      <w:r>
+        <w:rPr>
+          <w:rFonts w:ascii="Arial" w:hAnsi="Arial" w:cs="Arial"/>
+          <w:color w:val="000000"/>
+          <w:sz w:val="18"/>
+          <w:highlight w:val="lightGray"/>
+        </w:rPr>
+        <w:t>Name_En</w:t>
+      </w:r>
+      <w:proofErr w:type="spellEnd"/>
+      <w:r>
+        <w:rPr>
+          <w:rFonts w:ascii="Arial" w:hAnsi="Arial" w:cs="Arial"/>
+          <w:color w:val="000000"/>
+          <w:sz w:val="18"/>
+          <w:highlight w:val="lightGray"/>
+        </w:rPr>
+        <w:t xml:space="preserve"> Column: Motasem Essam] -&gt; </w:t>
+      </w:r>
+      <w:r>
+        <w:rPr>
+          <w:rFonts w:ascii="Arial" w:hAnsi="Arial" w:cs="Arial"/>
           <w:b/>
           <w:color w:val="000000"/>
           <w:sz w:val="18"/>
@@ -8326,6 +9006,7 @@
       </w:r>
       <w:r>
         <w:rPr>
+          <w:rFonts w:ascii="Arial" w:hAnsi="Arial" w:cs="Arial"/>
           <w:color w:val="000000"/>
           <w:sz w:val="18"/>
           <w:highlight w:val="lightGray"/>
@@ -8334,6 +9015,7 @@
       </w:r>
       <w:r>
         <w:rPr>
+          <w:rFonts w:ascii="Arial" w:hAnsi="Arial" w:cs="Arial"/>
           <w:b/>
           <w:color w:val="000000"/>
           <w:sz w:val="18"/>
@@ -8343,6 +9025,7 @@
       </w:r>
       <w:r>
         <w:rPr>
+          <w:rFonts w:ascii="Arial" w:hAnsi="Arial" w:cs="Arial"/>
           <w:color w:val="000000"/>
           <w:sz w:val="18"/>
           <w:highlight w:val="lightGray"/>
@@ -8553,6 +9236,7 @@
         <w:rPr>
           <w:rFonts w:ascii="Roboto Mono" w:eastAsia="Roboto Mono" w:hAnsi="Roboto Mono"/>
         </w:rPr>
+        <w:lastRenderedPageBreak/>
         <w:t>ROLLBACK;</w:t>
       </w:r>
     </w:p>
@@ -8588,6 +9272,7 @@
     <w:p>
       <w:r>
         <w:rPr>
+          <w:rFonts w:ascii="Arial" w:hAnsi="Arial" w:cs="Arial"/>
           <w:b/>
           <w:color w:val="000000"/>
           <w:sz w:val="18"/>
@@ -8597,14 +9282,36 @@
       </w:r>
       <w:r>
         <w:rPr>
-          <w:color w:val="000000"/>
-          <w:sz w:val="18"/>
-          <w:highlight w:val="lightGray"/>
-        </w:rPr>
-        <w:t xml:space="preserve">: Persons Table -&gt; ID Column: 1, Name_En Column: Motasem Essam] -&gt; </w:t>
-      </w:r>
-      <w:r>
-        <w:rPr>
+          <w:rFonts w:ascii="Arial" w:hAnsi="Arial" w:cs="Arial"/>
+          <w:color w:val="000000"/>
+          <w:sz w:val="18"/>
+          <w:highlight w:val="lightGray"/>
+        </w:rPr>
+        <w:t xml:space="preserve">: Persons Table -&gt; ID Column: 1, </w:t>
+      </w:r>
+      <w:proofErr w:type="spellStart"/>
+      <w:r>
+        <w:rPr>
+          <w:rFonts w:ascii="Arial" w:hAnsi="Arial" w:cs="Arial"/>
+          <w:color w:val="000000"/>
+          <w:sz w:val="18"/>
+          <w:highlight w:val="lightGray"/>
+        </w:rPr>
+        <w:t>Name_En</w:t>
+      </w:r>
+      <w:proofErr w:type="spellEnd"/>
+      <w:r>
+        <w:rPr>
+          <w:rFonts w:ascii="Arial" w:hAnsi="Arial" w:cs="Arial"/>
+          <w:color w:val="000000"/>
+          <w:sz w:val="18"/>
+          <w:highlight w:val="lightGray"/>
+        </w:rPr>
+        <w:t xml:space="preserve"> Column: Motasem Essam] -&gt; </w:t>
+      </w:r>
+      <w:r>
+        <w:rPr>
+          <w:rFonts w:ascii="Arial" w:hAnsi="Arial" w:cs="Arial"/>
           <w:b/>
           <w:color w:val="000000"/>
           <w:sz w:val="18"/>
@@ -8614,6 +9321,7 @@
       </w:r>
       <w:r>
         <w:rPr>
+          <w:rFonts w:ascii="Arial" w:hAnsi="Arial" w:cs="Arial"/>
           <w:color w:val="000000"/>
           <w:sz w:val="18"/>
           <w:highlight w:val="lightGray"/>
@@ -8622,6 +9330,7 @@
       </w:r>
       <w:r>
         <w:rPr>
+          <w:rFonts w:ascii="Arial" w:hAnsi="Arial" w:cs="Arial"/>
           <w:b/>
           <w:color w:val="000000"/>
           <w:sz w:val="18"/>
@@ -8631,6 +9340,7 @@
       </w:r>
       <w:r>
         <w:rPr>
+          <w:rFonts w:ascii="Arial" w:hAnsi="Arial" w:cs="Arial"/>
           <w:color w:val="000000"/>
           <w:sz w:val="18"/>
           <w:highlight w:val="lightGray"/>
@@ -8890,6 +9600,7 @@
         <w:rPr>
           <w:rFonts w:ascii="Segoe UI Emoji" w:hAnsi="Segoe UI Emoji" w:cs="Segoe UI Emoji"/>
         </w:rPr>
+        <w:lastRenderedPageBreak/>
         <w:t>🔍</w:t>
       </w:r>
       <w:r>
@@ -8899,6 +9610,7 @@
     <w:p>
       <w:r>
         <w:rPr>
+          <w:rFonts w:ascii="Arial" w:hAnsi="Arial" w:cs="Arial"/>
           <w:b/>
           <w:color w:val="000000"/>
           <w:sz w:val="18"/>
@@ -8908,14 +9620,36 @@
       </w:r>
       <w:r>
         <w:rPr>
-          <w:color w:val="000000"/>
-          <w:sz w:val="18"/>
-          <w:highlight w:val="lightGray"/>
-        </w:rPr>
-        <w:t xml:space="preserve">: Persons Table -&gt; ID Column: 1, Name_En Column: Motasem Essam] -&gt; </w:t>
-      </w:r>
-      <w:r>
-        <w:rPr>
+          <w:rFonts w:ascii="Arial" w:hAnsi="Arial" w:cs="Arial"/>
+          <w:color w:val="000000"/>
+          <w:sz w:val="18"/>
+          <w:highlight w:val="lightGray"/>
+        </w:rPr>
+        <w:t xml:space="preserve">: Persons Table -&gt; ID Column: 1, </w:t>
+      </w:r>
+      <w:proofErr w:type="spellStart"/>
+      <w:r>
+        <w:rPr>
+          <w:rFonts w:ascii="Arial" w:hAnsi="Arial" w:cs="Arial"/>
+          <w:color w:val="000000"/>
+          <w:sz w:val="18"/>
+          <w:highlight w:val="lightGray"/>
+        </w:rPr>
+        <w:t>Name_En</w:t>
+      </w:r>
+      <w:proofErr w:type="spellEnd"/>
+      <w:r>
+        <w:rPr>
+          <w:rFonts w:ascii="Arial" w:hAnsi="Arial" w:cs="Arial"/>
+          <w:color w:val="000000"/>
+          <w:sz w:val="18"/>
+          <w:highlight w:val="lightGray"/>
+        </w:rPr>
+        <w:t xml:space="preserve"> Column: Motasem Essam] -&gt; </w:t>
+      </w:r>
+      <w:r>
+        <w:rPr>
+          <w:rFonts w:ascii="Arial" w:hAnsi="Arial" w:cs="Arial"/>
           <w:b/>
           <w:color w:val="000000"/>
           <w:sz w:val="18"/>
@@ -8925,6 +9659,7 @@
       </w:r>
       <w:r>
         <w:rPr>
+          <w:rFonts w:ascii="Arial" w:hAnsi="Arial" w:cs="Arial"/>
           <w:color w:val="000000"/>
           <w:sz w:val="18"/>
           <w:highlight w:val="lightGray"/>
@@ -8933,6 +9668,7 @@
       </w:r>
       <w:r>
         <w:rPr>
+          <w:rFonts w:ascii="Arial" w:hAnsi="Arial" w:cs="Arial"/>
           <w:b/>
           <w:color w:val="000000"/>
           <w:sz w:val="18"/>
@@ -8942,6 +9678,7 @@
       </w:r>
       <w:r>
         <w:rPr>
+          <w:rFonts w:ascii="Arial" w:hAnsi="Arial" w:cs="Arial"/>
           <w:color w:val="000000"/>
           <w:sz w:val="18"/>
           <w:highlight w:val="lightGray"/>
@@ -9064,6 +9801,7 @@
                 <w:bCs/>
               </w:rPr>
             </w:pPr>
+            <w:proofErr w:type="spellStart"/>
             <w:r>
               <w:rPr>
                 <w:rFonts w:ascii="Roboto Mono" w:eastAsia="Roboto Mono" w:hAnsi="Roboto Mono"/>
@@ -9072,6 +9810,7 @@
               </w:rPr>
               <w:t>ProductID</w:t>
             </w:r>
+            <w:proofErr w:type="spellEnd"/>
           </w:p>
         </w:tc>
         <w:tc>
@@ -9571,6 +10310,7 @@
                 <w:b/>
                 <w:bCs/>
               </w:rPr>
+              <w:lastRenderedPageBreak/>
               <w:t>ProductName</w:t>
             </w:r>
           </w:p>
@@ -9659,6 +10399,7 @@
     <w:p>
       <w:r>
         <w:rPr>
+          <w:rFonts w:ascii="Arial" w:hAnsi="Arial" w:cs="Arial"/>
           <w:b/>
           <w:color w:val="000000"/>
           <w:sz w:val="18"/>
@@ -9668,14 +10409,36 @@
       </w:r>
       <w:r>
         <w:rPr>
-          <w:color w:val="000000"/>
-          <w:sz w:val="18"/>
-          <w:highlight w:val="lightGray"/>
-        </w:rPr>
-        <w:t xml:space="preserve">: Persons Table -&gt; ID Column: 1, Name_En Column: Motasem Essam] -&gt; </w:t>
-      </w:r>
-      <w:r>
-        <w:rPr>
+          <w:rFonts w:ascii="Arial" w:hAnsi="Arial" w:cs="Arial"/>
+          <w:color w:val="000000"/>
+          <w:sz w:val="18"/>
+          <w:highlight w:val="lightGray"/>
+        </w:rPr>
+        <w:t xml:space="preserve">: Persons Table -&gt; ID Column: 1, </w:t>
+      </w:r>
+      <w:proofErr w:type="spellStart"/>
+      <w:r>
+        <w:rPr>
+          <w:rFonts w:ascii="Arial" w:hAnsi="Arial" w:cs="Arial"/>
+          <w:color w:val="000000"/>
+          <w:sz w:val="18"/>
+          <w:highlight w:val="lightGray"/>
+        </w:rPr>
+        <w:t>Name_En</w:t>
+      </w:r>
+      <w:proofErr w:type="spellEnd"/>
+      <w:r>
+        <w:rPr>
+          <w:rFonts w:ascii="Arial" w:hAnsi="Arial" w:cs="Arial"/>
+          <w:color w:val="000000"/>
+          <w:sz w:val="18"/>
+          <w:highlight w:val="lightGray"/>
+        </w:rPr>
+        <w:t xml:space="preserve"> Column: Motasem Essam] -&gt; </w:t>
+      </w:r>
+      <w:r>
+        <w:rPr>
+          <w:rFonts w:ascii="Arial" w:hAnsi="Arial" w:cs="Arial"/>
           <w:b/>
           <w:color w:val="000000"/>
           <w:sz w:val="18"/>
@@ -9685,6 +10448,7 @@
       </w:r>
       <w:r>
         <w:rPr>
+          <w:rFonts w:ascii="Arial" w:hAnsi="Arial" w:cs="Arial"/>
           <w:color w:val="000000"/>
           <w:sz w:val="18"/>
           <w:highlight w:val="lightGray"/>
@@ -9693,6 +10457,7 @@
       </w:r>
       <w:r>
         <w:rPr>
+          <w:rFonts w:ascii="Arial" w:hAnsi="Arial" w:cs="Arial"/>
           <w:b/>
           <w:color w:val="000000"/>
           <w:sz w:val="18"/>
@@ -9702,6 +10467,7 @@
       </w:r>
       <w:r>
         <w:rPr>
+          <w:rFonts w:ascii="Arial" w:hAnsi="Arial" w:cs="Arial"/>
           <w:color w:val="000000"/>
           <w:sz w:val="18"/>
           <w:highlight w:val="lightGray"/>
@@ -9995,6 +10761,7 @@
         <w:rPr>
           <w:rFonts w:ascii="Roboto Mono" w:eastAsia="Roboto Mono" w:hAnsi="Roboto Mono"/>
         </w:rPr>
+        <w:lastRenderedPageBreak/>
         <w:pict w14:anchorId="7288B55E">
           <v:rect id="_x0000_i1062" style="width:0;height:1.5pt" o:hralign="center" o:hrstd="t" o:hr="t" fillcolor="#a0a0a0" stroked="f"/>
         </w:pict>
@@ -10023,6 +10790,7 @@
       </w:pPr>
       <w:r>
         <w:rPr>
+          <w:rFonts w:ascii="Arial" w:hAnsi="Arial" w:cs="Arial"/>
           <w:b/>
           <w:color w:val="000000"/>
           <w:sz w:val="18"/>
@@ -10032,14 +10800,36 @@
       </w:r>
       <w:r>
         <w:rPr>
-          <w:color w:val="000000"/>
-          <w:sz w:val="18"/>
-          <w:highlight w:val="lightGray"/>
-        </w:rPr>
-        <w:t xml:space="preserve">: Persons Table -&gt; ID Column: 1, Name_En Column: Motasem Essam] -&gt; </w:t>
-      </w:r>
-      <w:r>
-        <w:rPr>
+          <w:rFonts w:ascii="Arial" w:hAnsi="Arial" w:cs="Arial"/>
+          <w:color w:val="000000"/>
+          <w:sz w:val="18"/>
+          <w:highlight w:val="lightGray"/>
+        </w:rPr>
+        <w:t xml:space="preserve">: Persons Table -&gt; ID Column: 1, </w:t>
+      </w:r>
+      <w:proofErr w:type="spellStart"/>
+      <w:r>
+        <w:rPr>
+          <w:rFonts w:ascii="Arial" w:hAnsi="Arial" w:cs="Arial"/>
+          <w:color w:val="000000"/>
+          <w:sz w:val="18"/>
+          <w:highlight w:val="lightGray"/>
+        </w:rPr>
+        <w:t>Name_En</w:t>
+      </w:r>
+      <w:proofErr w:type="spellEnd"/>
+      <w:r>
+        <w:rPr>
+          <w:rFonts w:ascii="Arial" w:hAnsi="Arial" w:cs="Arial"/>
+          <w:color w:val="000000"/>
+          <w:sz w:val="18"/>
+          <w:highlight w:val="lightGray"/>
+        </w:rPr>
+        <w:t xml:space="preserve"> Column: Motasem Essam] -&gt; </w:t>
+      </w:r>
+      <w:r>
+        <w:rPr>
+          <w:rFonts w:ascii="Arial" w:hAnsi="Arial" w:cs="Arial"/>
           <w:b/>
           <w:color w:val="000000"/>
           <w:sz w:val="18"/>
@@ -10049,6 +10839,7 @@
       </w:r>
       <w:r>
         <w:rPr>
+          <w:rFonts w:ascii="Arial" w:hAnsi="Arial" w:cs="Arial"/>
           <w:color w:val="000000"/>
           <w:sz w:val="18"/>
           <w:highlight w:val="lightGray"/>
@@ -10057,6 +10848,7 @@
       </w:r>
       <w:r>
         <w:rPr>
+          <w:rFonts w:ascii="Arial" w:hAnsi="Arial" w:cs="Arial"/>
           <w:b/>
           <w:color w:val="000000"/>
           <w:sz w:val="18"/>
@@ -10066,6 +10858,7 @@
       </w:r>
       <w:r>
         <w:rPr>
+          <w:rFonts w:ascii="Arial" w:hAnsi="Arial" w:cs="Arial"/>
           <w:color w:val="000000"/>
           <w:sz w:val="18"/>
           <w:highlight w:val="lightGray"/>
@@ -10456,6 +11249,7 @@
     <w:p>
       <w:r>
         <w:rPr>
+          <w:rFonts w:ascii="Arial" w:hAnsi="Arial" w:cs="Arial"/>
           <w:b/>
           <w:color w:val="000000"/>
           <w:sz w:val="18"/>
@@ -10465,14 +11259,36 @@
       </w:r>
       <w:r>
         <w:rPr>
-          <w:color w:val="000000"/>
-          <w:sz w:val="18"/>
-          <w:highlight w:val="lightGray"/>
-        </w:rPr>
-        <w:t xml:space="preserve">: Persons Table -&gt; ID Column: 1, Name_En Column: Motasem Essam] -&gt; </w:t>
-      </w:r>
-      <w:r>
-        <w:rPr>
+          <w:rFonts w:ascii="Arial" w:hAnsi="Arial" w:cs="Arial"/>
+          <w:color w:val="000000"/>
+          <w:sz w:val="18"/>
+          <w:highlight w:val="lightGray"/>
+        </w:rPr>
+        <w:t xml:space="preserve">: Persons Table -&gt; ID Column: 1, </w:t>
+      </w:r>
+      <w:proofErr w:type="spellStart"/>
+      <w:r>
+        <w:rPr>
+          <w:rFonts w:ascii="Arial" w:hAnsi="Arial" w:cs="Arial"/>
+          <w:color w:val="000000"/>
+          <w:sz w:val="18"/>
+          <w:highlight w:val="lightGray"/>
+        </w:rPr>
+        <w:t>Name_En</w:t>
+      </w:r>
+      <w:proofErr w:type="spellEnd"/>
+      <w:r>
+        <w:rPr>
+          <w:rFonts w:ascii="Arial" w:hAnsi="Arial" w:cs="Arial"/>
+          <w:color w:val="000000"/>
+          <w:sz w:val="18"/>
+          <w:highlight w:val="lightGray"/>
+        </w:rPr>
+        <w:t xml:space="preserve"> Column: Motasem Essam] -&gt; </w:t>
+      </w:r>
+      <w:r>
+        <w:rPr>
+          <w:rFonts w:ascii="Arial" w:hAnsi="Arial" w:cs="Arial"/>
           <w:b/>
           <w:color w:val="000000"/>
           <w:sz w:val="18"/>
@@ -10482,6 +11298,7 @@
       </w:r>
       <w:r>
         <w:rPr>
+          <w:rFonts w:ascii="Arial" w:hAnsi="Arial" w:cs="Arial"/>
           <w:color w:val="000000"/>
           <w:sz w:val="18"/>
           <w:highlight w:val="lightGray"/>
@@ -10490,6 +11307,7 @@
       </w:r>
       <w:r>
         <w:rPr>
+          <w:rFonts w:ascii="Arial" w:hAnsi="Arial" w:cs="Arial"/>
           <w:b/>
           <w:color w:val="000000"/>
           <w:sz w:val="18"/>
@@ -10499,6 +11317,7 @@
       </w:r>
       <w:r>
         <w:rPr>
+          <w:rFonts w:ascii="Arial" w:hAnsi="Arial" w:cs="Arial"/>
           <w:color w:val="000000"/>
           <w:sz w:val="18"/>
           <w:highlight w:val="lightGray"/>
@@ -10634,6 +11453,7 @@
         <w:rPr>
           <w:noProof/>
         </w:rPr>
+        <w:lastRenderedPageBreak/>
         <w:drawing>
           <wp:inline distT="0" distB="0" distL="0" distR="0" wp14:anchorId="12ED331D" wp14:editId="30CE8E11">
             <wp:extent cx="5943600" cy="635635"/>
@@ -10958,6 +11778,7 @@
       </w:pPr>
       <w:r>
         <w:rPr>
+          <w:rFonts w:ascii="Arial" w:hAnsi="Arial" w:cs="Arial"/>
           <w:b/>
           <w:color w:val="000000"/>
           <w:sz w:val="18"/>
@@ -10967,14 +11788,36 @@
       </w:r>
       <w:r>
         <w:rPr>
-          <w:color w:val="000000"/>
-          <w:sz w:val="18"/>
-          <w:highlight w:val="lightGray"/>
-        </w:rPr>
-        <w:t xml:space="preserve">: Persons Table -&gt; ID Column: 1, Name_En Column: Motasem Essam] -&gt; </w:t>
-      </w:r>
-      <w:r>
-        <w:rPr>
+          <w:rFonts w:ascii="Arial" w:hAnsi="Arial" w:cs="Arial"/>
+          <w:color w:val="000000"/>
+          <w:sz w:val="18"/>
+          <w:highlight w:val="lightGray"/>
+        </w:rPr>
+        <w:t xml:space="preserve">: Persons Table -&gt; ID Column: 1, </w:t>
+      </w:r>
+      <w:proofErr w:type="spellStart"/>
+      <w:r>
+        <w:rPr>
+          <w:rFonts w:ascii="Arial" w:hAnsi="Arial" w:cs="Arial"/>
+          <w:color w:val="000000"/>
+          <w:sz w:val="18"/>
+          <w:highlight w:val="lightGray"/>
+        </w:rPr>
+        <w:t>Name_En</w:t>
+      </w:r>
+      <w:proofErr w:type="spellEnd"/>
+      <w:r>
+        <w:rPr>
+          <w:rFonts w:ascii="Arial" w:hAnsi="Arial" w:cs="Arial"/>
+          <w:color w:val="000000"/>
+          <w:sz w:val="18"/>
+          <w:highlight w:val="lightGray"/>
+        </w:rPr>
+        <w:t xml:space="preserve"> Column: Motasem Essam] -&gt; </w:t>
+      </w:r>
+      <w:r>
+        <w:rPr>
+          <w:rFonts w:ascii="Arial" w:hAnsi="Arial" w:cs="Arial"/>
           <w:b/>
           <w:color w:val="000000"/>
           <w:sz w:val="18"/>
@@ -10984,6 +11827,7 @@
       </w:r>
       <w:r>
         <w:rPr>
+          <w:rFonts w:ascii="Arial" w:hAnsi="Arial" w:cs="Arial"/>
           <w:color w:val="000000"/>
           <w:sz w:val="18"/>
           <w:highlight w:val="lightGray"/>
@@ -10992,6 +11836,7 @@
       </w:r>
       <w:r>
         <w:rPr>
+          <w:rFonts w:ascii="Arial" w:hAnsi="Arial" w:cs="Arial"/>
           <w:b/>
           <w:color w:val="000000"/>
           <w:sz w:val="18"/>
@@ -11001,6 +11846,7 @@
       </w:r>
       <w:r>
         <w:rPr>
+          <w:rFonts w:ascii="Arial" w:hAnsi="Arial" w:cs="Arial"/>
           <w:color w:val="000000"/>
           <w:sz w:val="18"/>
           <w:highlight w:val="lightGray"/>
@@ -11013,6 +11859,7 @@
         <w:rPr>
           <w:noProof/>
         </w:rPr>
+        <w:lastRenderedPageBreak/>
         <w:drawing>
           <wp:inline distT="114300" distB="114300" distL="114300" distR="114300" wp14:anchorId="33864CB8" wp14:editId="423A0370">
             <wp:extent cx="5943600" cy="3289300"/>
@@ -11956,13 +12803,24 @@
                 <w:rFonts w:ascii="Roboto Mono" w:hAnsi="Roboto Mono"/>
               </w:rPr>
             </w:pPr>
+            <w:proofErr w:type="spellStart"/>
             <w:r>
               <w:rPr>
                 <w:rFonts w:ascii="Roboto Mono" w:eastAsia="Roboto Mono" w:hAnsi="Roboto Mono"/>
                 <w:b/>
                 <w:bCs/>
               </w:rPr>
-              <w:t>Upsert Support</w:t>
+              <w:lastRenderedPageBreak/>
+              <w:t>Upsert</w:t>
+            </w:r>
+            <w:proofErr w:type="spellEnd"/>
+            <w:r>
+              <w:rPr>
+                <w:rFonts w:ascii="Roboto Mono" w:eastAsia="Roboto Mono" w:hAnsi="Roboto Mono"/>
+                <w:b/>
+                <w:bCs/>
+              </w:rPr>
+              <w:t xml:space="preserve"> Support</w:t>
             </w:r>
           </w:p>
         </w:tc>
@@ -12657,7 +13515,25 @@
           <w:sz w:val="18"/>
           <w:highlight w:val="lightGray"/>
         </w:rPr>
-        <w:t xml:space="preserve">: Persons Table -&gt; ID Column: 1, Name_En Column: Motasem Essam] -&gt; </w:t>
+        <w:t xml:space="preserve">: Persons Table -&gt; ID Column: 1, </w:t>
+      </w:r>
+      <w:proofErr w:type="spellStart"/>
+      <w:r>
+        <w:rPr>
+          <w:color w:val="000000"/>
+          <w:sz w:val="18"/>
+          <w:highlight w:val="lightGray"/>
+        </w:rPr>
+        <w:t>Name_En</w:t>
+      </w:r>
+      <w:proofErr w:type="spellEnd"/>
+      <w:r>
+        <w:rPr>
+          <w:color w:val="000000"/>
+          <w:sz w:val="18"/>
+          <w:highlight w:val="lightGray"/>
+        </w:rPr>
+        <w:t xml:space="preserve"> Column: Motasem Essam] -&gt; </w:t>
       </w:r>
       <w:r>
         <w:rPr>
@@ -12739,6 +13615,7 @@
       </w:pPr>
       <w:r>
         <w:rPr>
+          <w:rFonts w:ascii="Arial" w:hAnsi="Arial" w:cs="Arial"/>
           <w:b/>
           <w:color w:val="000000"/>
           <w:sz w:val="18"/>
@@ -12748,14 +13625,36 @@
       </w:r>
       <w:r>
         <w:rPr>
-          <w:color w:val="000000"/>
-          <w:sz w:val="18"/>
-          <w:highlight w:val="lightGray"/>
-        </w:rPr>
-        <w:t xml:space="preserve">: Persons Table -&gt; ID Column: 1, Name_En Column: Motasem Essam] -&gt; </w:t>
-      </w:r>
-      <w:r>
-        <w:rPr>
+          <w:rFonts w:ascii="Arial" w:hAnsi="Arial" w:cs="Arial"/>
+          <w:color w:val="000000"/>
+          <w:sz w:val="18"/>
+          <w:highlight w:val="lightGray"/>
+        </w:rPr>
+        <w:t xml:space="preserve">: Persons Table -&gt; ID Column: 1, </w:t>
+      </w:r>
+      <w:proofErr w:type="spellStart"/>
+      <w:r>
+        <w:rPr>
+          <w:rFonts w:ascii="Arial" w:hAnsi="Arial" w:cs="Arial"/>
+          <w:color w:val="000000"/>
+          <w:sz w:val="18"/>
+          <w:highlight w:val="lightGray"/>
+        </w:rPr>
+        <w:t>Name_En</w:t>
+      </w:r>
+      <w:proofErr w:type="spellEnd"/>
+      <w:r>
+        <w:rPr>
+          <w:rFonts w:ascii="Arial" w:hAnsi="Arial" w:cs="Arial"/>
+          <w:color w:val="000000"/>
+          <w:sz w:val="18"/>
+          <w:highlight w:val="lightGray"/>
+        </w:rPr>
+        <w:t xml:space="preserve"> Column: Motasem Essam] -&gt; </w:t>
+      </w:r>
+      <w:r>
+        <w:rPr>
+          <w:rFonts w:ascii="Arial" w:hAnsi="Arial" w:cs="Arial"/>
           <w:b/>
           <w:color w:val="000000"/>
           <w:sz w:val="18"/>
@@ -12765,6 +13664,7 @@
       </w:r>
       <w:r>
         <w:rPr>
+          <w:rFonts w:ascii="Arial" w:hAnsi="Arial" w:cs="Arial"/>
           <w:color w:val="000000"/>
           <w:sz w:val="18"/>
           <w:highlight w:val="lightGray"/>
@@ -12773,6 +13673,7 @@
       </w:r>
       <w:r>
         <w:rPr>
+          <w:rFonts w:ascii="Arial" w:hAnsi="Arial" w:cs="Arial"/>
           <w:b/>
           <w:color w:val="000000"/>
           <w:sz w:val="18"/>
@@ -12782,6 +13683,7 @@
       </w:r>
       <w:r>
         <w:rPr>
+          <w:rFonts w:ascii="Arial" w:hAnsi="Arial" w:cs="Arial"/>
           <w:color w:val="000000"/>
           <w:sz w:val="18"/>
           <w:highlight w:val="lightGray"/>
@@ -12862,6 +13764,7 @@
         <w:rPr>
           <w:rFonts w:ascii="Segoe UI Emoji" w:hAnsi="Segoe UI Emoji" w:cs="Segoe UI Emoji"/>
         </w:rPr>
+        <w:lastRenderedPageBreak/>
         <w:t>🟢</w:t>
       </w:r>
       <w:r>
@@ -12881,6 +13784,7 @@
       </w:pPr>
       <w:r>
         <w:rPr>
+          <w:rFonts w:ascii="Arial" w:hAnsi="Arial" w:cs="Arial"/>
           <w:b/>
           <w:color w:val="000000"/>
           <w:sz w:val="18"/>
@@ -12890,14 +13794,36 @@
       </w:r>
       <w:r>
         <w:rPr>
-          <w:color w:val="000000"/>
-          <w:sz w:val="18"/>
-          <w:highlight w:val="lightGray"/>
-        </w:rPr>
-        <w:t xml:space="preserve">: Persons Table -&gt; ID Column: 1, Name_En Column: Motasem Essam] -&gt; </w:t>
-      </w:r>
-      <w:r>
-        <w:rPr>
+          <w:rFonts w:ascii="Arial" w:hAnsi="Arial" w:cs="Arial"/>
+          <w:color w:val="000000"/>
+          <w:sz w:val="18"/>
+          <w:highlight w:val="lightGray"/>
+        </w:rPr>
+        <w:t xml:space="preserve">: Persons Table -&gt; ID Column: 1, </w:t>
+      </w:r>
+      <w:proofErr w:type="spellStart"/>
+      <w:r>
+        <w:rPr>
+          <w:rFonts w:ascii="Arial" w:hAnsi="Arial" w:cs="Arial"/>
+          <w:color w:val="000000"/>
+          <w:sz w:val="18"/>
+          <w:highlight w:val="lightGray"/>
+        </w:rPr>
+        <w:t>Name_En</w:t>
+      </w:r>
+      <w:proofErr w:type="spellEnd"/>
+      <w:r>
+        <w:rPr>
+          <w:rFonts w:ascii="Arial" w:hAnsi="Arial" w:cs="Arial"/>
+          <w:color w:val="000000"/>
+          <w:sz w:val="18"/>
+          <w:highlight w:val="lightGray"/>
+        </w:rPr>
+        <w:t xml:space="preserve"> Column: Motasem Essam] -&gt; </w:t>
+      </w:r>
+      <w:r>
+        <w:rPr>
+          <w:rFonts w:ascii="Arial" w:hAnsi="Arial" w:cs="Arial"/>
           <w:b/>
           <w:color w:val="000000"/>
           <w:sz w:val="18"/>
@@ -12907,6 +13833,7 @@
       </w:r>
       <w:r>
         <w:rPr>
+          <w:rFonts w:ascii="Arial" w:hAnsi="Arial" w:cs="Arial"/>
           <w:color w:val="000000"/>
           <w:sz w:val="18"/>
           <w:highlight w:val="lightGray"/>
@@ -12915,6 +13842,7 @@
       </w:r>
       <w:r>
         <w:rPr>
+          <w:rFonts w:ascii="Arial" w:hAnsi="Arial" w:cs="Arial"/>
           <w:b/>
           <w:color w:val="000000"/>
           <w:sz w:val="18"/>
@@ -12924,6 +13852,7 @@
       </w:r>
       <w:r>
         <w:rPr>
+          <w:rFonts w:ascii="Arial" w:hAnsi="Arial" w:cs="Arial"/>
           <w:color w:val="000000"/>
           <w:sz w:val="18"/>
           <w:highlight w:val="lightGray"/>
@@ -13022,7 +13951,21 @@
         <w:rPr>
           <w:rFonts w:ascii="Roboto Mono" w:eastAsia="Roboto Mono" w:hAnsi="Roboto Mono"/>
         </w:rPr>
-        <w:t>DO UPDATE SET email = EXCLUDED.email;</w:t>
+        <w:t xml:space="preserve">DO UPDATE SET email = </w:t>
+      </w:r>
+      <w:proofErr w:type="spellStart"/>
+      <w:r>
+        <w:rPr>
+          <w:rFonts w:ascii="Roboto Mono" w:eastAsia="Roboto Mono" w:hAnsi="Roboto Mono"/>
+        </w:rPr>
+        <w:t>EXCLUDED.email</w:t>
+      </w:r>
+      <w:proofErr w:type="spellEnd"/>
+      <w:r>
+        <w:rPr>
+          <w:rFonts w:ascii="Roboto Mono" w:eastAsia="Roboto Mono" w:hAnsi="Roboto Mono"/>
+        </w:rPr>
+        <w:t>;</w:t>
       </w:r>
     </w:p>
     <w:p>
@@ -13133,6 +14076,7 @@
       </w:pPr>
       <w:r>
         <w:rPr>
+          <w:rFonts w:ascii="Arial" w:hAnsi="Arial" w:cs="Arial"/>
           <w:b/>
           <w:color w:val="000000"/>
           <w:sz w:val="18"/>
@@ -13142,14 +14086,36 @@
       </w:r>
       <w:r>
         <w:rPr>
-          <w:color w:val="000000"/>
-          <w:sz w:val="18"/>
-          <w:highlight w:val="lightGray"/>
-        </w:rPr>
-        <w:t xml:space="preserve">: Persons Table -&gt; ID Column: 1, Name_En Column: Motasem Essam] -&gt; </w:t>
-      </w:r>
-      <w:r>
-        <w:rPr>
+          <w:rFonts w:ascii="Arial" w:hAnsi="Arial" w:cs="Arial"/>
+          <w:color w:val="000000"/>
+          <w:sz w:val="18"/>
+          <w:highlight w:val="lightGray"/>
+        </w:rPr>
+        <w:t xml:space="preserve">: Persons Table -&gt; ID Column: 1, </w:t>
+      </w:r>
+      <w:proofErr w:type="spellStart"/>
+      <w:r>
+        <w:rPr>
+          <w:rFonts w:ascii="Arial" w:hAnsi="Arial" w:cs="Arial"/>
+          <w:color w:val="000000"/>
+          <w:sz w:val="18"/>
+          <w:highlight w:val="lightGray"/>
+        </w:rPr>
+        <w:t>Name_En</w:t>
+      </w:r>
+      <w:proofErr w:type="spellEnd"/>
+      <w:r>
+        <w:rPr>
+          <w:rFonts w:ascii="Arial" w:hAnsi="Arial" w:cs="Arial"/>
+          <w:color w:val="000000"/>
+          <w:sz w:val="18"/>
+          <w:highlight w:val="lightGray"/>
+        </w:rPr>
+        <w:t xml:space="preserve"> Column: Motasem Essam] -&gt; </w:t>
+      </w:r>
+      <w:r>
+        <w:rPr>
+          <w:rFonts w:ascii="Arial" w:hAnsi="Arial" w:cs="Arial"/>
           <w:b/>
           <w:color w:val="000000"/>
           <w:sz w:val="18"/>
@@ -13159,6 +14125,7 @@
       </w:r>
       <w:r>
         <w:rPr>
+          <w:rFonts w:ascii="Arial" w:hAnsi="Arial" w:cs="Arial"/>
           <w:color w:val="000000"/>
           <w:sz w:val="18"/>
           <w:highlight w:val="lightGray"/>
@@ -13167,6 +14134,7 @@
       </w:r>
       <w:r>
         <w:rPr>
+          <w:rFonts w:ascii="Arial" w:hAnsi="Arial" w:cs="Arial"/>
           <w:b/>
           <w:color w:val="000000"/>
           <w:sz w:val="18"/>
@@ -13176,6 +14144,7 @@
       </w:r>
       <w:r>
         <w:rPr>
+          <w:rFonts w:ascii="Arial" w:hAnsi="Arial" w:cs="Arial"/>
           <w:color w:val="000000"/>
           <w:sz w:val="18"/>
           <w:highlight w:val="lightGray"/>
@@ -13248,6 +14217,7 @@
         <w:rPr>
           <w:rFonts w:ascii="Roboto Mono" w:eastAsia="Roboto Mono" w:hAnsi="Roboto Mono"/>
         </w:rPr>
+        <w:lastRenderedPageBreak/>
         <w:t>VALUES (1, 'Alice', 'alice@example.com')</w:t>
       </w:r>
     </w:p>
@@ -13376,6 +14346,7 @@
       </w:pPr>
       <w:r>
         <w:rPr>
+          <w:rFonts w:ascii="Arial" w:hAnsi="Arial" w:cs="Arial"/>
           <w:b/>
           <w:color w:val="000000"/>
           <w:sz w:val="18"/>
@@ -13385,14 +14356,36 @@
       </w:r>
       <w:r>
         <w:rPr>
-          <w:color w:val="000000"/>
-          <w:sz w:val="18"/>
-          <w:highlight w:val="lightGray"/>
-        </w:rPr>
-        <w:t xml:space="preserve">: Persons Table -&gt; ID Column: 1, Name_En Column: Motasem Essam] -&gt; </w:t>
-      </w:r>
-      <w:r>
-        <w:rPr>
+          <w:rFonts w:ascii="Arial" w:hAnsi="Arial" w:cs="Arial"/>
+          <w:color w:val="000000"/>
+          <w:sz w:val="18"/>
+          <w:highlight w:val="lightGray"/>
+        </w:rPr>
+        <w:t xml:space="preserve">: Persons Table -&gt; ID Column: 1, </w:t>
+      </w:r>
+      <w:proofErr w:type="spellStart"/>
+      <w:r>
+        <w:rPr>
+          <w:rFonts w:ascii="Arial" w:hAnsi="Arial" w:cs="Arial"/>
+          <w:color w:val="000000"/>
+          <w:sz w:val="18"/>
+          <w:highlight w:val="lightGray"/>
+        </w:rPr>
+        <w:t>Name_En</w:t>
+      </w:r>
+      <w:proofErr w:type="spellEnd"/>
+      <w:r>
+        <w:rPr>
+          <w:rFonts w:ascii="Arial" w:hAnsi="Arial" w:cs="Arial"/>
+          <w:color w:val="000000"/>
+          <w:sz w:val="18"/>
+          <w:highlight w:val="lightGray"/>
+        </w:rPr>
+        <w:t xml:space="preserve"> Column: Motasem Essam] -&gt; </w:t>
+      </w:r>
+      <w:r>
+        <w:rPr>
+          <w:rFonts w:ascii="Arial" w:hAnsi="Arial" w:cs="Arial"/>
           <w:b/>
           <w:color w:val="000000"/>
           <w:sz w:val="18"/>
@@ -13402,6 +14395,7 @@
       </w:r>
       <w:r>
         <w:rPr>
+          <w:rFonts w:ascii="Arial" w:hAnsi="Arial" w:cs="Arial"/>
           <w:color w:val="000000"/>
           <w:sz w:val="18"/>
           <w:highlight w:val="lightGray"/>
@@ -13410,6 +14404,7 @@
       </w:r>
       <w:r>
         <w:rPr>
+          <w:rFonts w:ascii="Arial" w:hAnsi="Arial" w:cs="Arial"/>
           <w:b/>
           <w:color w:val="000000"/>
           <w:sz w:val="18"/>
@@ -13419,6 +14414,7 @@
       </w:r>
       <w:r>
         <w:rPr>
+          <w:rFonts w:ascii="Arial" w:hAnsi="Arial" w:cs="Arial"/>
           <w:color w:val="000000"/>
           <w:sz w:val="18"/>
           <w:highlight w:val="lightGray"/>
@@ -13530,8 +14526,30 @@
         <w:rPr>
           <w:rFonts w:ascii="Roboto Mono" w:eastAsia="Roboto Mono" w:hAnsi="Roboto Mono"/>
         </w:rPr>
-        <w:t xml:space="preserve">    UPDATE SET target.email = source.email</w:t>
-      </w:r>
+        <w:t xml:space="preserve">    UPDATE SET </w:t>
+      </w:r>
+      <w:proofErr w:type="spellStart"/>
+      <w:r>
+        <w:rPr>
+          <w:rFonts w:ascii="Roboto Mono" w:eastAsia="Roboto Mono" w:hAnsi="Roboto Mono"/>
+        </w:rPr>
+        <w:t>target.email</w:t>
+      </w:r>
+      <w:proofErr w:type="spellEnd"/>
+      <w:r>
+        <w:rPr>
+          <w:rFonts w:ascii="Roboto Mono" w:eastAsia="Roboto Mono" w:hAnsi="Roboto Mono"/>
+        </w:rPr>
+        <w:t xml:space="preserve"> = </w:t>
+      </w:r>
+      <w:proofErr w:type="spellStart"/>
+      <w:r>
+        <w:rPr>
+          <w:rFonts w:ascii="Roboto Mono" w:eastAsia="Roboto Mono" w:hAnsi="Roboto Mono"/>
+        </w:rPr>
+        <w:t>source.email</w:t>
+      </w:r>
+      <w:proofErr w:type="spellEnd"/>
     </w:p>
     <w:p>
       <w:pPr>
@@ -13569,7 +14587,22 @@
         <w:rPr>
           <w:rFonts w:ascii="Roboto Mono" w:eastAsia="Roboto Mono" w:hAnsi="Roboto Mono"/>
         </w:rPr>
-        <w:t xml:space="preserve">    VALUES (source.id, source.name, source.email);</w:t>
+        <w:lastRenderedPageBreak/>
+        <w:t xml:space="preserve">    VALUES (source.id, source.name, </w:t>
+      </w:r>
+      <w:proofErr w:type="spellStart"/>
+      <w:r>
+        <w:rPr>
+          <w:rFonts w:ascii="Roboto Mono" w:eastAsia="Roboto Mono" w:hAnsi="Roboto Mono"/>
+        </w:rPr>
+        <w:t>source.email</w:t>
+      </w:r>
+      <w:proofErr w:type="spellEnd"/>
+      <w:r>
+        <w:rPr>
+          <w:rFonts w:ascii="Roboto Mono" w:eastAsia="Roboto Mono" w:hAnsi="Roboto Mono"/>
+        </w:rPr>
+        <w:t>);</w:t>
       </w:r>
     </w:p>
     <w:p>
@@ -13607,7 +14640,21 @@
         <w:rPr>
           <w:rFonts w:ascii="Roboto Mono" w:eastAsia="Roboto Mono" w:hAnsi="Roboto Mono"/>
         </w:rPr>
-        <w:t xml:space="preserve"> for complex upsert logic.</w:t>
+        <w:t xml:space="preserve"> for complex </w:t>
+      </w:r>
+      <w:proofErr w:type="spellStart"/>
+      <w:r>
+        <w:rPr>
+          <w:rFonts w:ascii="Roboto Mono" w:eastAsia="Roboto Mono" w:hAnsi="Roboto Mono"/>
+        </w:rPr>
+        <w:t>upsert</w:t>
+      </w:r>
+      <w:proofErr w:type="spellEnd"/>
+      <w:r>
+        <w:rPr>
+          <w:rFonts w:ascii="Roboto Mono" w:eastAsia="Roboto Mono" w:hAnsi="Roboto Mono"/>
+        </w:rPr>
+        <w:t xml:space="preserve"> logic.</w:t>
       </w:r>
       <w:r>
         <w:rPr>
@@ -13676,6 +14723,7 @@
       </w:pPr>
       <w:r>
         <w:rPr>
+          <w:rFonts w:ascii="Arial" w:hAnsi="Arial" w:cs="Arial"/>
           <w:b/>
           <w:color w:val="000000"/>
           <w:sz w:val="18"/>
@@ -13685,14 +14733,36 @@
       </w:r>
       <w:r>
         <w:rPr>
-          <w:color w:val="000000"/>
-          <w:sz w:val="18"/>
-          <w:highlight w:val="lightGray"/>
-        </w:rPr>
-        <w:t xml:space="preserve">: Persons Table -&gt; ID Column: 1, Name_En Column: Motasem Essam] -&gt; </w:t>
-      </w:r>
-      <w:r>
-        <w:rPr>
+          <w:rFonts w:ascii="Arial" w:hAnsi="Arial" w:cs="Arial"/>
+          <w:color w:val="000000"/>
+          <w:sz w:val="18"/>
+          <w:highlight w:val="lightGray"/>
+        </w:rPr>
+        <w:t xml:space="preserve">: Persons Table -&gt; ID Column: 1, </w:t>
+      </w:r>
+      <w:proofErr w:type="spellStart"/>
+      <w:r>
+        <w:rPr>
+          <w:rFonts w:ascii="Arial" w:hAnsi="Arial" w:cs="Arial"/>
+          <w:color w:val="000000"/>
+          <w:sz w:val="18"/>
+          <w:highlight w:val="lightGray"/>
+        </w:rPr>
+        <w:t>Name_En</w:t>
+      </w:r>
+      <w:proofErr w:type="spellEnd"/>
+      <w:r>
+        <w:rPr>
+          <w:rFonts w:ascii="Arial" w:hAnsi="Arial" w:cs="Arial"/>
+          <w:color w:val="000000"/>
+          <w:sz w:val="18"/>
+          <w:highlight w:val="lightGray"/>
+        </w:rPr>
+        <w:t xml:space="preserve"> Column: Motasem Essam] -&gt; </w:t>
+      </w:r>
+      <w:r>
+        <w:rPr>
+          <w:rFonts w:ascii="Arial" w:hAnsi="Arial" w:cs="Arial"/>
           <w:b/>
           <w:color w:val="000000"/>
           <w:sz w:val="18"/>
@@ -13702,6 +14772,7 @@
       </w:r>
       <w:r>
         <w:rPr>
+          <w:rFonts w:ascii="Arial" w:hAnsi="Arial" w:cs="Arial"/>
           <w:color w:val="000000"/>
           <w:sz w:val="18"/>
           <w:highlight w:val="lightGray"/>
@@ -13710,6 +14781,7 @@
       </w:r>
       <w:r>
         <w:rPr>
+          <w:rFonts w:ascii="Arial" w:hAnsi="Arial" w:cs="Arial"/>
           <w:b/>
           <w:color w:val="000000"/>
           <w:sz w:val="18"/>
@@ -13719,6 +14791,7 @@
       </w:r>
       <w:r>
         <w:rPr>
+          <w:rFonts w:ascii="Arial" w:hAnsi="Arial" w:cs="Arial"/>
           <w:color w:val="000000"/>
           <w:sz w:val="18"/>
           <w:highlight w:val="lightGray"/>
@@ -13830,8 +14903,30 @@
         <w:rPr>
           <w:rFonts w:ascii="Roboto Mono" w:eastAsia="Roboto Mono" w:hAnsi="Roboto Mono"/>
         </w:rPr>
-        <w:t xml:space="preserve">    UPDATE SET target.email = source.email</w:t>
-      </w:r>
+        <w:t xml:space="preserve">    UPDATE SET </w:t>
+      </w:r>
+      <w:proofErr w:type="spellStart"/>
+      <w:r>
+        <w:rPr>
+          <w:rFonts w:ascii="Roboto Mono" w:eastAsia="Roboto Mono" w:hAnsi="Roboto Mono"/>
+        </w:rPr>
+        <w:t>target.email</w:t>
+      </w:r>
+      <w:proofErr w:type="spellEnd"/>
+      <w:r>
+        <w:rPr>
+          <w:rFonts w:ascii="Roboto Mono" w:eastAsia="Roboto Mono" w:hAnsi="Roboto Mono"/>
+        </w:rPr>
+        <w:t xml:space="preserve"> = </w:t>
+      </w:r>
+      <w:proofErr w:type="spellStart"/>
+      <w:r>
+        <w:rPr>
+          <w:rFonts w:ascii="Roboto Mono" w:eastAsia="Roboto Mono" w:hAnsi="Roboto Mono"/>
+        </w:rPr>
+        <w:t>source.email</w:t>
+      </w:r>
+      <w:proofErr w:type="spellEnd"/>
     </w:p>
     <w:p>
       <w:pPr>
@@ -13869,7 +14964,21 @@
         <w:rPr>
           <w:rFonts w:ascii="Roboto Mono" w:eastAsia="Roboto Mono" w:hAnsi="Roboto Mono"/>
         </w:rPr>
-        <w:t xml:space="preserve">    VALUES (source.id, source.name, source.email);</w:t>
+        <w:t xml:space="preserve">    VALUES (source.id, source.name, </w:t>
+      </w:r>
+      <w:proofErr w:type="spellStart"/>
+      <w:r>
+        <w:rPr>
+          <w:rFonts w:ascii="Roboto Mono" w:eastAsia="Roboto Mono" w:hAnsi="Roboto Mono"/>
+        </w:rPr>
+        <w:t>source.email</w:t>
+      </w:r>
+      <w:proofErr w:type="spellEnd"/>
+      <w:r>
+        <w:rPr>
+          <w:rFonts w:ascii="Roboto Mono" w:eastAsia="Roboto Mono" w:hAnsi="Roboto Mono"/>
+        </w:rPr>
+        <w:t>);</w:t>
       </w:r>
     </w:p>
     <w:p>
@@ -13996,6 +15105,7 @@
       </w:pPr>
       <w:r>
         <w:rPr>
+          <w:rFonts w:ascii="Arial" w:hAnsi="Arial" w:cs="Arial"/>
           <w:b/>
           <w:color w:val="000000"/>
           <w:sz w:val="18"/>
@@ -14005,14 +15115,36 @@
       </w:r>
       <w:r>
         <w:rPr>
-          <w:color w:val="000000"/>
-          <w:sz w:val="18"/>
-          <w:highlight w:val="lightGray"/>
-        </w:rPr>
-        <w:t xml:space="preserve">: Persons Table -&gt; ID Column: 1, Name_En Column: Motasem Essam] -&gt; </w:t>
-      </w:r>
-      <w:r>
-        <w:rPr>
+          <w:rFonts w:ascii="Arial" w:hAnsi="Arial" w:cs="Arial"/>
+          <w:color w:val="000000"/>
+          <w:sz w:val="18"/>
+          <w:highlight w:val="lightGray"/>
+        </w:rPr>
+        <w:t xml:space="preserve">: Persons Table -&gt; ID Column: 1, </w:t>
+      </w:r>
+      <w:proofErr w:type="spellStart"/>
+      <w:r>
+        <w:rPr>
+          <w:rFonts w:ascii="Arial" w:hAnsi="Arial" w:cs="Arial"/>
+          <w:color w:val="000000"/>
+          <w:sz w:val="18"/>
+          <w:highlight w:val="lightGray"/>
+        </w:rPr>
+        <w:t>Name_En</w:t>
+      </w:r>
+      <w:proofErr w:type="spellEnd"/>
+      <w:r>
+        <w:rPr>
+          <w:rFonts w:ascii="Arial" w:hAnsi="Arial" w:cs="Arial"/>
+          <w:color w:val="000000"/>
+          <w:sz w:val="18"/>
+          <w:highlight w:val="lightGray"/>
+        </w:rPr>
+        <w:t xml:space="preserve"> Column: Motasem Essam] -&gt; </w:t>
+      </w:r>
+      <w:r>
+        <w:rPr>
+          <w:rFonts w:ascii="Arial" w:hAnsi="Arial" w:cs="Arial"/>
           <w:b/>
           <w:color w:val="000000"/>
           <w:sz w:val="18"/>
@@ -14022,6 +15154,7 @@
       </w:r>
       <w:r>
         <w:rPr>
+          <w:rFonts w:ascii="Arial" w:hAnsi="Arial" w:cs="Arial"/>
           <w:color w:val="000000"/>
           <w:sz w:val="18"/>
           <w:highlight w:val="lightGray"/>
@@ -14030,6 +15163,7 @@
       </w:r>
       <w:r>
         <w:rPr>
+          <w:rFonts w:ascii="Arial" w:hAnsi="Arial" w:cs="Arial"/>
           <w:b/>
           <w:color w:val="000000"/>
           <w:sz w:val="18"/>
@@ -14039,6 +15173,7 @@
       </w:r>
       <w:r>
         <w:rPr>
+          <w:rFonts w:ascii="Arial" w:hAnsi="Arial" w:cs="Arial"/>
           <w:color w:val="000000"/>
           <w:sz w:val="18"/>
           <w:highlight w:val="lightGray"/>
@@ -14778,6 +15913,7 @@
     <w:p>
       <w:r>
         <w:rPr>
+          <w:rFonts w:ascii="Arial" w:hAnsi="Arial" w:cs="Arial"/>
           <w:b/>
           <w:color w:val="000000"/>
           <w:sz w:val="18"/>
@@ -14787,14 +15923,36 @@
       </w:r>
       <w:r>
         <w:rPr>
-          <w:color w:val="000000"/>
-          <w:sz w:val="18"/>
-          <w:highlight w:val="lightGray"/>
-        </w:rPr>
-        <w:t xml:space="preserve">: Persons Table -&gt; ID Column: 1, Name_En Column: Motasem Essam] -&gt; </w:t>
-      </w:r>
-      <w:r>
-        <w:rPr>
+          <w:rFonts w:ascii="Arial" w:hAnsi="Arial" w:cs="Arial"/>
+          <w:color w:val="000000"/>
+          <w:sz w:val="18"/>
+          <w:highlight w:val="lightGray"/>
+        </w:rPr>
+        <w:t xml:space="preserve">: Persons Table -&gt; ID Column: 1, </w:t>
+      </w:r>
+      <w:proofErr w:type="spellStart"/>
+      <w:r>
+        <w:rPr>
+          <w:rFonts w:ascii="Arial" w:hAnsi="Arial" w:cs="Arial"/>
+          <w:color w:val="000000"/>
+          <w:sz w:val="18"/>
+          <w:highlight w:val="lightGray"/>
+        </w:rPr>
+        <w:t>Name_En</w:t>
+      </w:r>
+      <w:proofErr w:type="spellEnd"/>
+      <w:r>
+        <w:rPr>
+          <w:rFonts w:ascii="Arial" w:hAnsi="Arial" w:cs="Arial"/>
+          <w:color w:val="000000"/>
+          <w:sz w:val="18"/>
+          <w:highlight w:val="lightGray"/>
+        </w:rPr>
+        <w:t xml:space="preserve"> Column: Motasem Essam] -&gt; </w:t>
+      </w:r>
+      <w:r>
+        <w:rPr>
+          <w:rFonts w:ascii="Arial" w:hAnsi="Arial" w:cs="Arial"/>
           <w:b/>
           <w:color w:val="000000"/>
           <w:sz w:val="18"/>
@@ -14804,6 +15962,7 @@
       </w:r>
       <w:r>
         <w:rPr>
+          <w:rFonts w:ascii="Arial" w:hAnsi="Arial" w:cs="Arial"/>
           <w:color w:val="000000"/>
           <w:sz w:val="18"/>
           <w:highlight w:val="lightGray"/>
@@ -14812,6 +15971,7 @@
       </w:r>
       <w:r>
         <w:rPr>
+          <w:rFonts w:ascii="Arial" w:hAnsi="Arial" w:cs="Arial"/>
           <w:b/>
           <w:color w:val="000000"/>
           <w:sz w:val="18"/>
@@ -14821,6 +15981,7 @@
       </w:r>
       <w:r>
         <w:rPr>
+          <w:rFonts w:ascii="Arial" w:hAnsi="Arial" w:cs="Arial"/>
           <w:color w:val="000000"/>
           <w:sz w:val="18"/>
           <w:highlight w:val="lightGray"/>
@@ -14838,6 +15999,7 @@
         <w:rPr>
           <w:rFonts w:ascii="Roboto Mono" w:eastAsia="Roboto Mono" w:hAnsi="Roboto Mono"/>
         </w:rPr>
+        <w:lastRenderedPageBreak/>
         <w:t>Think of a restaurant:</w:t>
       </w:r>
     </w:p>
@@ -15170,6 +16332,7 @@
     <w:p>
       <w:r>
         <w:rPr>
+          <w:rFonts w:ascii="Arial" w:hAnsi="Arial" w:cs="Arial"/>
           <w:b/>
           <w:color w:val="000000"/>
           <w:sz w:val="18"/>
@@ -15179,14 +16342,36 @@
       </w:r>
       <w:r>
         <w:rPr>
-          <w:color w:val="000000"/>
-          <w:sz w:val="18"/>
-          <w:highlight w:val="lightGray"/>
-        </w:rPr>
-        <w:t xml:space="preserve">: Persons Table -&gt; ID Column: 1, Name_En Column: Motasem Essam] -&gt; </w:t>
-      </w:r>
-      <w:r>
-        <w:rPr>
+          <w:rFonts w:ascii="Arial" w:hAnsi="Arial" w:cs="Arial"/>
+          <w:color w:val="000000"/>
+          <w:sz w:val="18"/>
+          <w:highlight w:val="lightGray"/>
+        </w:rPr>
+        <w:t xml:space="preserve">: Persons Table -&gt; ID Column: 1, </w:t>
+      </w:r>
+      <w:proofErr w:type="spellStart"/>
+      <w:r>
+        <w:rPr>
+          <w:rFonts w:ascii="Arial" w:hAnsi="Arial" w:cs="Arial"/>
+          <w:color w:val="000000"/>
+          <w:sz w:val="18"/>
+          <w:highlight w:val="lightGray"/>
+        </w:rPr>
+        <w:t>Name_En</w:t>
+      </w:r>
+      <w:proofErr w:type="spellEnd"/>
+      <w:r>
+        <w:rPr>
+          <w:rFonts w:ascii="Arial" w:hAnsi="Arial" w:cs="Arial"/>
+          <w:color w:val="000000"/>
+          <w:sz w:val="18"/>
+          <w:highlight w:val="lightGray"/>
+        </w:rPr>
+        <w:t xml:space="preserve"> Column: Motasem Essam] -&gt; </w:t>
+      </w:r>
+      <w:r>
+        <w:rPr>
+          <w:rFonts w:ascii="Arial" w:hAnsi="Arial" w:cs="Arial"/>
           <w:b/>
           <w:color w:val="000000"/>
           <w:sz w:val="18"/>
@@ -15196,6 +16381,7 @@
       </w:r>
       <w:r>
         <w:rPr>
+          <w:rFonts w:ascii="Arial" w:hAnsi="Arial" w:cs="Arial"/>
           <w:color w:val="000000"/>
           <w:sz w:val="18"/>
           <w:highlight w:val="lightGray"/>
@@ -15204,6 +16390,7 @@
       </w:r>
       <w:r>
         <w:rPr>
+          <w:rFonts w:ascii="Arial" w:hAnsi="Arial" w:cs="Arial"/>
           <w:b/>
           <w:color w:val="000000"/>
           <w:sz w:val="18"/>
@@ -15213,6 +16400,7 @@
       </w:r>
       <w:r>
         <w:rPr>
+          <w:rFonts w:ascii="Arial" w:hAnsi="Arial" w:cs="Arial"/>
           <w:color w:val="000000"/>
           <w:sz w:val="18"/>
           <w:highlight w:val="lightGray"/>
@@ -15294,7 +16482,14 @@
         <w:rPr>
           <w:rFonts w:ascii="Roboto Mono" w:eastAsia="Roboto Mono" w:hAnsi="Roboto Mono"/>
         </w:rPr>
-        <w:t xml:space="preserve"> data, as well as manage database structures, permissions, and transactions. SQL is used with database systems such as MySQL, PostgreSQL, SQL Server, Oracle, and SQLite, making it one of the most important technologies in database development.</w:t>
+        <w:t xml:space="preserve"> data, as well as manage database structures, permissions, and transactions. SQL is used with database systems such as MySQL, PostgreSQL, SQL Server, Oracle, and SQLite, </w:t>
+      </w:r>
+      <w:r>
+        <w:rPr>
+          <w:rFonts w:ascii="Roboto Mono" w:eastAsia="Roboto Mono" w:hAnsi="Roboto Mono"/>
+        </w:rPr>
+        <w:lastRenderedPageBreak/>
+        <w:t>making it one of the most important technologies in database development.</w:t>
       </w:r>
     </w:p>
     <w:p>

</xml_diff>